<commit_message>
DIP-14: Strengthen literature review and add labelled design dialogues
</commit_message>
<xml_diff>
--- a/docs/report/en/Tappix-Pre-Defense-Report-EN.docx
+++ b/docs/report/en/Tappix-Pre-Defense-Report-EN.docx
@@ -104,7 +104,7 @@
               <w:bottom w:w="105" w:type="dxa"/>
               <w:right w:w="105" w:type="dxa"/>
             </w:tcMar>
-            <w:shd w:fill="233F35"/>
+            <w:shd w:fill="233746"/>
           </w:tcPr>
           <w:p>
             <w:pPr>
@@ -136,7 +136,7 @@
               <w:bottom w:w="105" w:type="dxa"/>
               <w:right w:w="105" w:type="dxa"/>
             </w:tcMar>
-            <w:shd w:fill="233F35"/>
+            <w:shd w:fill="233746"/>
           </w:tcPr>
           <w:p>
             <w:pPr>
@@ -169,7 +169,7 @@
               <w:bottom w:w="105" w:type="dxa"/>
               <w:right w:w="105" w:type="dxa"/>
             </w:tcMar>
-            <w:shd w:fill="233F35"/>
+            <w:shd w:fill="233746"/>
           </w:tcPr>
           <w:p>
             <w:pPr>
@@ -251,7 +251,7 @@
                 <w:color w:val="172D29"/>
                 <w:sz w:val="18"/>
               </w:rPr>
-              <w:t>2–6</w:t>
+              <w:t>2–7</w:t>
             </w:r>
           </w:p>
         </w:tc>
@@ -283,7 +283,7 @@
                 <w:color w:val="172D29"/>
                 <w:sz w:val="18"/>
               </w:rPr>
-              <w:t>Problem, literature, alternatives and technology choices</w:t>
+              <w:t>Problem, 12 research studies, alternatives and choices</w:t>
             </w:r>
           </w:p>
         </w:tc>
@@ -353,7 +353,7 @@
                 <w:color w:val="172D29"/>
                 <w:sz w:val="18"/>
               </w:rPr>
-              <w:t>7–11</w:t>
+              <w:t>8–12</w:t>
             </w:r>
           </w:p>
         </w:tc>
@@ -455,7 +455,7 @@
                 <w:color w:val="172D29"/>
                 <w:sz w:val="18"/>
               </w:rPr>
-              <w:t>12–15</w:t>
+              <w:t>13–16</w:t>
             </w:r>
           </w:p>
         </w:tc>
@@ -557,7 +557,7 @@
                 <w:color w:val="172D29"/>
                 <w:sz w:val="18"/>
               </w:rPr>
-              <w:t>16–20</w:t>
+              <w:t>17–22</w:t>
             </w:r>
           </w:p>
         </w:tc>
@@ -589,7 +589,7 @@
                 <w:color w:val="172D29"/>
                 <w:sz w:val="18"/>
               </w:rPr>
-              <w:t>Experiments, work plan, criteria and references</w:t>
+              <w:t>Experiments, work plan, criteria and 26 references</w:t>
             </w:r>
           </w:p>
         </w:tc>
@@ -626,7 +626,7 @@
                 <w:color w:val="172D29"/>
                 <w:sz w:val="18"/>
               </w:rPr>
-              <w:t>Research records</w:t>
+              <w:t>Design discussions</w:t>
             </w:r>
           </w:p>
         </w:tc>
@@ -659,7 +659,7 @@
                 <w:color w:val="172D29"/>
                 <w:sz w:val="18"/>
               </w:rPr>
-              <w:t>21–22</w:t>
+              <w:t>23–26</w:t>
             </w:r>
           </w:p>
         </w:tc>
@@ -691,7 +691,7 @@
                 <w:color w:val="172D29"/>
                 <w:sz w:val="18"/>
               </w:rPr>
-              <w:t>User discussion protocol and supervisor feedback form</w:t>
+              <w:t>AI role simulations and response to teacher feedback</w:t>
             </w:r>
           </w:p>
         </w:tc>
@@ -707,7 +707,7 @@
         <w:pStyle w:val="Caption"/>
       </w:pPr>
       <w:r>
-        <w:t>Status: design package for review. User interviews, substantive supervisor feedback and teammate approval remain outstanding. The existing Tappix implementation is a separate reference project; this report does not claim a new production release.</w:t>
+        <w:t>Revision of 24 October 2026: expanded scientific review and explicit links between evidence, design choices and evaluation. The appendix contains AI-simulated discussions, not participant interviews. Teacher feedback is recorded separately from the simulated adviser dialogue.</w:t>
       </w:r>
     </w:p>
     <w:p>
@@ -779,7 +779,7 @@
               <w:bottom w:w="105" w:type="dxa"/>
               <w:right w:w="105" w:type="dxa"/>
             </w:tcMar>
-            <w:shd w:fill="233F35"/>
+            <w:shd w:fill="233746"/>
           </w:tcPr>
           <w:p>
             <w:pPr>
@@ -811,7 +811,7 @@
               <w:bottom w:w="105" w:type="dxa"/>
               <w:right w:w="105" w:type="dxa"/>
             </w:tcMar>
-            <w:shd w:fill="233F35"/>
+            <w:shd w:fill="233746"/>
           </w:tcPr>
           <w:p>
             <w:pPr>
@@ -843,7 +843,7 @@
               <w:bottom w:w="105" w:type="dxa"/>
               <w:right w:w="105" w:type="dxa"/>
             </w:tcMar>
-            <w:shd w:fill="233F35"/>
+            <w:shd w:fill="233746"/>
           </w:tcPr>
           <w:p>
             <w:pPr>
@@ -1338,17 +1338,12 @@
         <w:pStyle w:val="Heading1"/>
       </w:pPr>
       <w:r>
-        <w:t>02  Research foundations</w:t>
+        <w:t>02  What loyalty research establishes</w:t>
       </w:r>
     </w:p>
     <w:p>
       <w:r>
-        <w:t>Thematic review • eight scientific studies • access checked in the source register on 24 October 2026</w:t>
-      </w:r>
-    </w:p>
-    <w:p>
-      <w:r>
-        <w:t>The review uses publisher pages and DOI records for loyalty programmes, digital engagement, reward redemption and customer retention. It is not an exhaustive systematic review. Paywalled papers were considered only through accessible abstracts or excerpts; no full-text access is implied.</w:t>
+        <w:t>Twelve scientific publications inform the design. Their findings do not establish demand for Tappix in Kazakhstan.</w:t>
       </w:r>
     </w:p>
     <w:p>
@@ -1356,12 +1351,17 @@
         <w:pStyle w:val="Heading2"/>
       </w:pPr>
       <w:r>
-        <w:t>S1  Loyalty programmes have context-dependent effects</w:t>
+        <w:t>Review method and boundaries</w:t>
       </w:r>
     </w:p>
     <w:p>
       <w:r>
-        <w:t>Belli et al. (2022) synthesise 429 effect sizes across four decades of loyalty-programme research. Their results distinguish behavioural effects from attitudinal loyalty and indicate variation across programmes and industries. For Tappix, repeat visits and subjective evaluations should be measured separately. A pooled effect is not a forecast for an individual coffee shop. Access: publisher abstract and metadata.</w:t>
+        <w:t>We selected research on programme effectiveness, reward progress, digital engagement and measurement bias. The search combined these themes with loyalty programme and customer retention terms. Publisher abstracts, accessible article sections and author or university copies were checked on 24 October 2026. This is a focused narrative review, not a systematic review with an exhaustive search or a quality-scored study pool.</w:t>
+      </w:r>
+    </w:p>
+    <w:p>
+      <w:r>
+        <w:t>The register contains twelve scientific publications [S1–S12], three product sources [P1–P3] and eleven technical sources [T1–T11]. Older studies are retained for their experimental or measurement contribution; recent studies add digital and contextual evidence. Where full text was unavailable, conclusions are limited to the accessible abstract and excerpts.</w:t>
       </w:r>
     </w:p>
     <w:p>
@@ -1369,12 +1369,17 @@
         <w:pStyle w:val="Heading2"/>
       </w:pPr>
       <w:r>
-        <w:t>S2  Programme design and research context matter</w:t>
+        <w:t>Participation is not the same as loyalty</w:t>
       </w:r>
     </w:p>
     <w:p>
       <w:r>
-        <w:t>Chen, Mandler and Meyer-Waarden (2021) review 131 publications using the theory, context, characteristics and methodology framework. Their review motivates an explicit description of the business segment, reward rules and evaluation method. It does not establish demand in Kazakhstan. Access: abstract and publicly available publisher excerpts.</w:t>
+        <w:t>Belli et al. [S1] synthesise 429 effect sizes and distinguish behavioural loyalty from attitudes toward a business. Chen et al. [S2] organise 131 publications by theory, context, programme characteristics and method. Together, they suggest that a programme should be described through its rules and setting before its effectiveness is assessed. A count of registered cards alone does not answer whether guests return more often.</w:t>
+      </w:r>
+    </w:p>
+    <w:p>
+      <w:r>
+        <w:t>Dorotic et al. [S9] explain why apparently conflicting results can coexist: programme effects vary across customer segments and markets. For Tappix, the initial unit of analysis should therefore be one business and its eligible guests. Aggregating unrelated salons and coffee shops into a single return rate would obscure different visit cycles.</w:t>
       </w:r>
     </w:p>
     <w:p>
@@ -1382,12 +1387,17 @@
         <w:pStyle w:val="Heading2"/>
       </w:pPr>
       <w:r>
-        <w:t>S3  Satisfaction is not a causal profit estimate</w:t>
+        <w:t>Software can record an outcome without causing it</w:t>
       </w:r>
     </w:p>
     <w:p>
       <w:r>
-        <w:t>Mittal et al. (2023) synthesise 535 correlations from 245 articles relating satisfaction to loyalty behaviours and financial outcomes. Associations vary by context and do not establish that deploying Tappix causes profit growth. Our evaluation therefore separates software correctness, usability and potential business effects. Access: abstract and introduction of the open article.</w:t>
+        <w:t>Mittal et al. [S3] report positive associations between satisfaction and customer or firm outcomes across 245 articles, with contextual variation. Liu-Thompkins et al. [S4] examine cognitive, affective and social drivers across 319 studies. These findings make service quality and customer experience relevant context; they do not show that issuing a digital card produces profit.</w:t>
+      </w:r>
+    </w:p>
+    <w:p>
+      <w:r>
+        <w:t>We consequently define the engineering contribution as reliable event recording, access boundaries and a usable counter workflow. Business benefit is a separate evaluation question. The owner dashboard will report visits and redemptions with named definitions, rather than displaying an unsupported sales-growth estimate.</w:t>
       </w:r>
     </w:p>
     <w:p>
@@ -1395,25 +1405,12 @@
         <w:pStyle w:val="Heading2"/>
       </w:pPr>
       <w:r>
-        <w:t>S4  Rewards are one of several loyalty mechanisms</w:t>
+        <w:t>A specific design consequence</w:t>
       </w:r>
     </w:p>
     <w:p>
       <w:r>
-        <w:t>Liu-Thompkins et al. (2022) analyse 1,908 effect sizes from 319 studies of cognitive, affective and social drivers of retailer loyalty. The broad retail setting limits direct transfer to small service businesses. Staffing, promotions and service quality should be recorded as potential confounders during a pilot. Access: publisher abstract and introduction; bibliographic metadata cross-checked.</w:t>
-      </w:r>
-    </w:p>
-    <w:p>
-      <w:pPr>
-        <w:pStyle w:val="Heading2"/>
-      </w:pPr>
-      <w:r>
-        <w:t>Implication for the project</w:t>
-      </w:r>
-    </w:p>
-    <w:p>
-      <w:r>
-        <w:t>The literature supports studying loyalty processes. It does not justify treating a digital card, a growing registration count or a positive satisfaction response as evidence of incremental sales.</w:t>
+        <w:t>FR-06 requires dashboard totals to reproduce a known event dataset. This is a correctness requirement derived by the team, not a result claimed by the marketing studies. A pilot can later investigate whether owners find these measures useful for decisions.</w:t>
       </w:r>
     </w:p>
     <w:p>
@@ -1426,7 +1423,7 @@
         <w:pStyle w:val="Heading1"/>
       </w:pPr>
       <w:r>
-        <w:t>03  Digital engagement and progress</w:t>
+        <w:t>03  Progress and digital engagement</w:t>
       </w:r>
     </w:p>
     <w:p>
@@ -1434,12 +1431,17 @@
         <w:pStyle w:val="Heading2"/>
       </w:pPr>
       <w:r>
-        <w:t>S5  Redemption and engagement change over time</w:t>
+        <w:t>Why the card shows progress</w:t>
       </w:r>
     </w:p>
     <w:p>
       <w:r>
-        <w:t>Son and Oh (2023) examine mobile technology, reward redemption and engagement transitions using transaction-related analyses and complementary research methods. The reported relationships motivate an activity history and longitudinal observation. They do not prove that a web card is superior to a native application. Access: publisher abstract, notes and metadata.</w:t>
+        <w:t>Kivetz et al. [S8] study the goal-gradient mechanism in reward programmes. Nunes and Drèze [S12] show that an endowed start can change persistence even when the remaining effort is unchanged. Both concern how a goal is perceived; neither justifies treating an unearned visit as a real purchase.</w:t>
+      </w:r>
+    </w:p>
+    <w:p>
+      <w:r>
+        <w:t>The concept therefore shows four confirmed visits out of six, a named reward and two remaining visits. If a business later offers a welcome credit, the interface and ledger must distinguish that promotion from a visit. We defer such promotions in the first implementation so the basic history stays easy to explain.</w:t>
       </w:r>
     </w:p>
     <w:p>
@@ -1447,12 +1449,17 @@
         <w:pStyle w:val="Heading2"/>
       </w:pPr>
       <w:r>
-        <w:t>S6  Point use depends on external conditions</w:t>
+        <w:t>A mobile channel does not remove operational friction</w:t>
       </w:r>
     </w:p>
     <w:p>
       <w:r>
-        <w:t>Jin, Kim and Lee (2024) apply logistic and panel regression to company loyalty data before and during the pandemic. Differences between groups and periods caution against reading every change in point spending as improved retention. Tappix should compare similar periods and record contextual changes. Access: abstract and publisher excerpts.</w:t>
+        <w:t>Son and Oh [S5] investigate reward redemption and engagement as loyalty becomes mobile. Their research motivates recording how guests use rewards over time, rather than counting enrolment alone. It does not establish that our web interface is preferable to a native wallet. We choose a link-based card to reduce installation steps and will test whether guests can find it again.</w:t>
+      </w:r>
+    </w:p>
+    <w:p>
+      <w:r>
+        <w:t>The staff design includes confirmation before a visit and a separate redemption action. These choices are operational hypotheses: a fast scanner is of little use if a cashier cannot tell whether a timed-out request succeeded. The evaluation must include camera refusal and a response lost after the database commit.</w:t>
       </w:r>
     </w:p>
     <w:p>
@@ -1460,12 +1467,17 @@
         <w:pStyle w:val="Heading2"/>
       </w:pPr>
       <w:r>
-        <w:t>S7  Feedback and observed behaviour are different evidence</w:t>
+        <w:t>Context changes the meaning of activity</w:t>
       </w:r>
     </w:p>
     <w:p>
       <w:r>
-        <w:t>Kuikka et al. (2025; published online in 2024) analyse 45,603 reviews of UK grocery retailers. Semantic evidence helps identify customer concerns, but review language is not the same as observed repeat purchasing. The setting differs from independent businesses in Kazakhstan. Tappix should combine qualitative feedback with recorded events. Access: abstract and research framing of the open article.</w:t>
+        <w:t>Jin et al. [S6] analyse point use around a major external disruption and identify differences between usage groups. Kuikka et al. [S7] examine 45,603 grocery-retailer reviews across pandemic-related periods. These contexts are unlike an independent Kazakhstani café, but they show why an activity change needs an explanation beyond the software launch.</w:t>
+      </w:r>
+    </w:p>
+    <w:p>
+      <w:r>
+        <w:t>During a pilot we should record promotions, opening hours, programme-rule changes and interruptions. Qualitative comments can explain a frustrating redemption; they cannot substitute for a visit record. Conversely, a visit total cannot explain why a guest abandoned registration.</w:t>
       </w:r>
     </w:p>
     <w:p>
@@ -1473,25 +1485,12 @@
         <w:pStyle w:val="Heading2"/>
       </w:pPr>
       <w:r>
-        <w:t>S8  Visible progress has a theoretical basis</w:t>
+        <w:t>Resulting prototype decisions</w:t>
       </w:r>
     </w:p>
     <w:p>
       <w:r>
-        <w:t>Kivetz, Urminsky and Zheng (2006) investigate the goal-gradient hypothesis using field experiments and customer data. This foundational study motivates a visible progress indicator near a reward. Its age and context require renewed evaluation. The design shows actual confirmed visits and does not manufacture progress or promise sales uplift. Access: publisher abstract and the first page of an author-hosted version.</w:t>
-      </w:r>
-    </w:p>
-    <w:p>
-      <w:pPr>
-        <w:pStyle w:val="Heading2"/>
-      </w:pPr>
-      <w:r>
-        <w:t>Research gap and limitations</w:t>
-      </w:r>
-    </w:p>
-    <w:p>
-      <w:r>
-        <w:t>The applied question is whether independent businesses can use a shared platform without sharing customer records, while staff complete visits and redemptions without developer assistance. No claim of a new theoretical model is made. Before the final defense, the review should be deepened through university library access and complemented with local empirical evidence.</w:t>
+        <w:t>P02 makes the reward and remaining effort visible. P03 and P04 separate an attempted operation from a confirmed result. P05 separates current available rewards from redemptions within a selected period. These are testable interface decisions, not findings from interviews.</w:t>
       </w:r>
     </w:p>
     <w:p>
@@ -1504,7 +1503,432 @@
         <w:pStyle w:val="Heading1"/>
       </w:pPr>
       <w:r>
-        <w:t>04  Existing solutions and alternatives</w:t>
+        <w:t>04  Measurement and research gap</w:t>
+      </w:r>
+    </w:p>
+    <w:p>
+      <w:pPr>
+        <w:pStyle w:val="Heading2"/>
+      </w:pPr>
+      <w:r>
+        <w:t>The selection problem</w:t>
+      </w:r>
+    </w:p>
+    <w:p>
+      <w:r>
+        <w:t>Leenheer et al. [S10] use household panel data and model the decision to join a programme. The estimated programme effect is smaller when self-selection is considered. This matters because guests who already visit often may be the first to register. Comparing registered and unregistered guests once would confound the programme with their earlier behaviour.</w:t>
+      </w:r>
+    </w:p>
+    <w:p>
+      <w:r>
+        <w:t>Liu [S11] follows a convenience-store programme over time and finds different responses among initially heavy, moderate and light buyers. A single average can therefore hide which guests changed behaviour. Tappix should retain timestamps and programme versions so later analysis can distinguish existing regulars from newer guests.</w:t>
+      </w:r>
+    </w:p>
+    <w:p>
+      <w:pPr>
+        <w:pStyle w:val="Heading2"/>
+      </w:pPr>
+      <w:r>
+        <w:t>What the first pilot can answer</w:t>
+      </w:r>
+    </w:p>
+    <w:p>
+      <w:r>
+        <w:t>A short pilot can establish whether a staff member records a valid visit without help, whether the reward is issued once, and whether the owner understands a metric. It cannot establish a stable retention effect for businesses with infrequent visits. A salon may require a longer observation window than a coffee shop; the period must be chosen before interpreting results.</w:t>
+      </w:r>
+    </w:p>
+    <w:p>
+      <w:r>
+        <w:t>For example, 45 repeat cards among 90 active cards in one week yields a 50% within-period repeat share. It says nothing about how many of last month’s guests returned this month. A retention cohort would require a separately specified starting population and follow-up window. The distinction is built into the metric definitions and usability questions.</w:t>
+      </w:r>
+    </w:p>
+    <w:tbl>
+      <w:tblPr>
+        <w:tblW w:type="auto" w:w="0"/>
+        <w:jc w:val="center"/>
+        <w:tblLayout w:type="fixed"/>
+        <w:tblLook w:firstColumn="1" w:firstRow="1" w:lastColumn="0" w:lastRow="0" w:noHBand="0" w:noVBand="1" w:val="04A0"/>
+      </w:tblPr>
+      <w:tblGrid>
+        <w:gridCol w:w="4032"/>
+        <w:gridCol w:w="5800"/>
+      </w:tblGrid>
+      <w:tr>
+        <w:trPr>
+          <w:cantSplit/>
+          <w:tblHeader/>
+        </w:trPr>
+        <w:tc>
+          <w:tcPr>
+            <w:tcW w:type="dxa" w:w="4032"/>
+            <w:vAlign w:val="center"/>
+            <w:tcBorders>
+              <w:top w:val="single" w:sz="4" w:color="D9D9D9"/>
+              <w:left w:val="single" w:sz="4" w:color="D9D9D9"/>
+              <w:bottom w:val="single" w:sz="4" w:color="D9D9D9"/>
+              <w:right w:val="single" w:sz="4" w:color="D9D9D9"/>
+            </w:tcBorders>
+            <w:tcMar>
+              <w:top w:w="105" w:type="dxa"/>
+              <w:left w:w="105" w:type="dxa"/>
+              <w:bottom w:w="105" w:type="dxa"/>
+              <w:right w:w="105" w:type="dxa"/>
+            </w:tcMar>
+            <w:shd w:fill="233746"/>
+          </w:tcPr>
+          <w:p>
+            <w:pPr>
+              <w:spacing w:after="0" w:line="259" w:lineRule="auto"/>
+            </w:pPr>
+            <w:r>
+              <w:rPr>
+                <w:b/>
+                <w:color w:val="FFFFFF"/>
+                <w:sz w:val="18"/>
+              </w:rPr>
+              <w:t>Evidence</w:t>
+            </w:r>
+          </w:p>
+        </w:tc>
+        <w:tc>
+          <w:tcPr>
+            <w:tcW w:type="dxa" w:w="5800"/>
+            <w:vAlign w:val="center"/>
+            <w:tcBorders>
+              <w:top w:val="single" w:sz="4" w:color="D9D9D9"/>
+              <w:left w:val="single" w:sz="4" w:color="D9D9D9"/>
+              <w:bottom w:val="single" w:sz="4" w:color="D9D9D9"/>
+              <w:right w:val="single" w:sz="4" w:color="D9D9D9"/>
+            </w:tcBorders>
+            <w:tcMar>
+              <w:top w:w="105" w:type="dxa"/>
+              <w:left w:w="105" w:type="dxa"/>
+              <w:bottom w:w="105" w:type="dxa"/>
+              <w:right w:w="105" w:type="dxa"/>
+            </w:tcMar>
+            <w:shd w:fill="233746"/>
+          </w:tcPr>
+          <w:p>
+            <w:pPr>
+              <w:spacing w:after="0" w:line="259" w:lineRule="auto"/>
+            </w:pPr>
+            <w:r>
+              <w:rPr>
+                <w:b/>
+                <w:color w:val="FFFFFF"/>
+                <w:sz w:val="18"/>
+              </w:rPr>
+              <w:t>Design or evaluation consequence</w:t>
+            </w:r>
+          </w:p>
+        </w:tc>
+      </w:tr>
+      <w:tr>
+        <w:trPr>
+          <w:cantSplit/>
+        </w:trPr>
+        <w:tc>
+          <w:tcPr>
+            <w:tcW w:type="dxa" w:w="4032"/>
+            <w:vAlign w:val="center"/>
+            <w:tcBorders>
+              <w:top w:val="single" w:sz="4" w:color="D9D9D9"/>
+              <w:left w:val="single" w:sz="4" w:color="D9D9D9"/>
+              <w:bottom w:val="single" w:sz="4" w:color="D9D9D9"/>
+              <w:right w:val="single" w:sz="4" w:color="D9D9D9"/>
+            </w:tcBorders>
+            <w:tcMar>
+              <w:top w:w="105" w:type="dxa"/>
+              <w:left w:w="105" w:type="dxa"/>
+              <w:bottom w:w="105" w:type="dxa"/>
+              <w:right w:w="105" w:type="dxa"/>
+            </w:tcMar>
+            <w:shd w:fill="FFFFFF"/>
+          </w:tcPr>
+          <w:p>
+            <w:pPr>
+              <w:spacing w:after="0" w:line="259" w:lineRule="auto"/>
+            </w:pPr>
+            <w:r>
+              <w:rPr>
+                <w:b w:val="0"/>
+                <w:color w:val="172D29"/>
+                <w:sz w:val="18"/>
+              </w:rPr>
+              <w:t>Programme context and heterogeneity [S1, S2, S9, S11]</w:t>
+            </w:r>
+          </w:p>
+        </w:tc>
+        <w:tc>
+          <w:tcPr>
+            <w:tcW w:type="dxa" w:w="5800"/>
+            <w:vAlign w:val="center"/>
+            <w:tcBorders>
+              <w:top w:val="single" w:sz="4" w:color="D9D9D9"/>
+              <w:left w:val="single" w:sz="4" w:color="D9D9D9"/>
+              <w:bottom w:val="single" w:sz="4" w:color="D9D9D9"/>
+              <w:right w:val="single" w:sz="4" w:color="D9D9D9"/>
+            </w:tcBorders>
+            <w:tcMar>
+              <w:top w:w="105" w:type="dxa"/>
+              <w:left w:w="105" w:type="dxa"/>
+              <w:bottom w:w="105" w:type="dxa"/>
+              <w:right w:w="105" w:type="dxa"/>
+            </w:tcMar>
+            <w:shd w:fill="FFFFFF"/>
+          </w:tcPr>
+          <w:p>
+            <w:pPr>
+              <w:spacing w:after="0" w:line="259" w:lineRule="auto"/>
+            </w:pPr>
+            <w:r>
+              <w:rPr>
+                <w:b w:val="0"/>
+                <w:color w:val="172D29"/>
+                <w:sz w:val="18"/>
+              </w:rPr>
+              <w:t>Retain company, programme and period context; avoid a universal uplift claim.</w:t>
+            </w:r>
+          </w:p>
+        </w:tc>
+      </w:tr>
+      <w:tr>
+        <w:trPr>
+          <w:cantSplit/>
+        </w:trPr>
+        <w:tc>
+          <w:tcPr>
+            <w:tcW w:type="dxa" w:w="4032"/>
+            <w:vAlign w:val="center"/>
+            <w:tcBorders>
+              <w:top w:val="single" w:sz="4" w:color="D9D9D9"/>
+              <w:left w:val="single" w:sz="4" w:color="D9D9D9"/>
+              <w:bottom w:val="single" w:sz="4" w:color="D9D9D9"/>
+              <w:right w:val="single" w:sz="4" w:color="D9D9D9"/>
+            </w:tcBorders>
+            <w:tcMar>
+              <w:top w:w="105" w:type="dxa"/>
+              <w:left w:w="105" w:type="dxa"/>
+              <w:bottom w:w="105" w:type="dxa"/>
+              <w:right w:w="105" w:type="dxa"/>
+            </w:tcMar>
+            <w:shd w:fill="F3F6F3"/>
+          </w:tcPr>
+          <w:p>
+            <w:pPr>
+              <w:spacing w:after="0" w:line="259" w:lineRule="auto"/>
+            </w:pPr>
+            <w:r>
+              <w:rPr>
+                <w:b w:val="0"/>
+                <w:color w:val="172D29"/>
+                <w:sz w:val="18"/>
+              </w:rPr>
+              <w:t>Progress framing [S8, S12]</w:t>
+            </w:r>
+          </w:p>
+        </w:tc>
+        <w:tc>
+          <w:tcPr>
+            <w:tcW w:type="dxa" w:w="5800"/>
+            <w:vAlign w:val="center"/>
+            <w:tcBorders>
+              <w:top w:val="single" w:sz="4" w:color="D9D9D9"/>
+              <w:left w:val="single" w:sz="4" w:color="D9D9D9"/>
+              <w:bottom w:val="single" w:sz="4" w:color="D9D9D9"/>
+              <w:right w:val="single" w:sz="4" w:color="D9D9D9"/>
+            </w:tcBorders>
+            <w:tcMar>
+              <w:top w:w="105" w:type="dxa"/>
+              <w:left w:w="105" w:type="dxa"/>
+              <w:bottom w:w="105" w:type="dxa"/>
+              <w:right w:w="105" w:type="dxa"/>
+            </w:tcMar>
+            <w:shd w:fill="F3F6F3"/>
+          </w:tcPr>
+          <w:p>
+            <w:pPr>
+              <w:spacing w:after="0" w:line="259" w:lineRule="auto"/>
+            </w:pPr>
+            <w:r>
+              <w:rPr>
+                <w:b w:val="0"/>
+                <w:color w:val="172D29"/>
+                <w:sz w:val="18"/>
+              </w:rPr>
+              <w:t>Show confirmed progress and explicit reward conditions; test comprehension.</w:t>
+            </w:r>
+          </w:p>
+        </w:tc>
+      </w:tr>
+      <w:tr>
+        <w:trPr>
+          <w:cantSplit/>
+        </w:trPr>
+        <w:tc>
+          <w:tcPr>
+            <w:tcW w:type="dxa" w:w="4032"/>
+            <w:vAlign w:val="center"/>
+            <w:tcBorders>
+              <w:top w:val="single" w:sz="4" w:color="D9D9D9"/>
+              <w:left w:val="single" w:sz="4" w:color="D9D9D9"/>
+              <w:bottom w:val="single" w:sz="4" w:color="D9D9D9"/>
+              <w:right w:val="single" w:sz="4" w:color="D9D9D9"/>
+            </w:tcBorders>
+            <w:tcMar>
+              <w:top w:w="105" w:type="dxa"/>
+              <w:left w:w="105" w:type="dxa"/>
+              <w:bottom w:w="105" w:type="dxa"/>
+              <w:right w:w="105" w:type="dxa"/>
+            </w:tcMar>
+            <w:shd w:fill="FFFFFF"/>
+          </w:tcPr>
+          <w:p>
+            <w:pPr>
+              <w:spacing w:after="0" w:line="259" w:lineRule="auto"/>
+            </w:pPr>
+            <w:r>
+              <w:rPr>
+                <w:b w:val="0"/>
+                <w:color w:val="172D29"/>
+                <w:sz w:val="18"/>
+              </w:rPr>
+              <w:t>Engagement and external changes [S5–S7]</w:t>
+            </w:r>
+          </w:p>
+        </w:tc>
+        <w:tc>
+          <w:tcPr>
+            <w:tcW w:type="dxa" w:w="5800"/>
+            <w:vAlign w:val="center"/>
+            <w:tcBorders>
+              <w:top w:val="single" w:sz="4" w:color="D9D9D9"/>
+              <w:left w:val="single" w:sz="4" w:color="D9D9D9"/>
+              <w:bottom w:val="single" w:sz="4" w:color="D9D9D9"/>
+              <w:right w:val="single" w:sz="4" w:color="D9D9D9"/>
+            </w:tcBorders>
+            <w:tcMar>
+              <w:top w:w="105" w:type="dxa"/>
+              <w:left w:w="105" w:type="dxa"/>
+              <w:bottom w:w="105" w:type="dxa"/>
+              <w:right w:w="105" w:type="dxa"/>
+            </w:tcMar>
+            <w:shd w:fill="FFFFFF"/>
+          </w:tcPr>
+          <w:p>
+            <w:pPr>
+              <w:spacing w:after="0" w:line="259" w:lineRule="auto"/>
+            </w:pPr>
+            <w:r>
+              <w:rPr>
+                <w:b w:val="0"/>
+                <w:color w:val="172D29"/>
+                <w:sz w:val="18"/>
+              </w:rPr>
+              <w:t>Keep event history and note concurrent operational changes during a pilot.</w:t>
+            </w:r>
+          </w:p>
+        </w:tc>
+      </w:tr>
+      <w:tr>
+        <w:trPr>
+          <w:cantSplit/>
+        </w:trPr>
+        <w:tc>
+          <w:tcPr>
+            <w:tcW w:type="dxa" w:w="4032"/>
+            <w:vAlign w:val="center"/>
+            <w:tcBorders>
+              <w:top w:val="single" w:sz="4" w:color="D9D9D9"/>
+              <w:left w:val="single" w:sz="4" w:color="D9D9D9"/>
+              <w:bottom w:val="single" w:sz="4" w:color="D9D9D9"/>
+              <w:right w:val="single" w:sz="4" w:color="D9D9D9"/>
+            </w:tcBorders>
+            <w:tcMar>
+              <w:top w:w="105" w:type="dxa"/>
+              <w:left w:w="105" w:type="dxa"/>
+              <w:bottom w:w="105" w:type="dxa"/>
+              <w:right w:w="105" w:type="dxa"/>
+            </w:tcMar>
+            <w:shd w:fill="F3F6F3"/>
+          </w:tcPr>
+          <w:p>
+            <w:pPr>
+              <w:spacing w:after="0" w:line="259" w:lineRule="auto"/>
+            </w:pPr>
+            <w:r>
+              <w:rPr>
+                <w:b w:val="0"/>
+                <w:color w:val="172D29"/>
+                <w:sz w:val="18"/>
+              </w:rPr>
+              <w:t>Selection and outcome measurement [S3, S4, S10]</w:t>
+            </w:r>
+          </w:p>
+        </w:tc>
+        <w:tc>
+          <w:tcPr>
+            <w:tcW w:type="dxa" w:w="5800"/>
+            <w:vAlign w:val="center"/>
+            <w:tcBorders>
+              <w:top w:val="single" w:sz="4" w:color="D9D9D9"/>
+              <w:left w:val="single" w:sz="4" w:color="D9D9D9"/>
+              <w:bottom w:val="single" w:sz="4" w:color="D9D9D9"/>
+              <w:right w:val="single" w:sz="4" w:color="D9D9D9"/>
+            </w:tcBorders>
+            <w:tcMar>
+              <w:top w:w="105" w:type="dxa"/>
+              <w:left w:w="105" w:type="dxa"/>
+              <w:bottom w:w="105" w:type="dxa"/>
+              <w:right w:w="105" w:type="dxa"/>
+            </w:tcMar>
+            <w:shd w:fill="F3F6F3"/>
+          </w:tcPr>
+          <w:p>
+            <w:pPr>
+              <w:spacing w:after="0" w:line="259" w:lineRule="auto"/>
+            </w:pPr>
+            <w:r>
+              <w:rPr>
+                <w:b w:val="0"/>
+                <w:color w:val="172D29"/>
+                <w:sz w:val="18"/>
+              </w:rPr>
+              <w:t>Separate software correctness, reported experience and causal business effects.</w:t>
+            </w:r>
+          </w:p>
+        </w:tc>
+      </w:tr>
+    </w:tbl>
+    <w:p>
+      <w:pPr>
+        <w:spacing w:after="0"/>
+      </w:pPr>
+    </w:p>
+    <w:p>
+      <w:pPr>
+        <w:pStyle w:val="Heading2"/>
+      </w:pPr>
+      <w:r>
+        <w:t>Applied contribution</w:t>
+      </w:r>
+    </w:p>
+    <w:p>
+      <w:r>
+        <w:t>The proposed contribution is a small multi-tenant information system whose reward operations and reports can be reproduced and checked. The literature motivates what to measure; it does not resolve local purchasing decisions, willingness to pay or required staff training. The simulated dialogues in Appendix A generate candidate checks for those unresolved questions.</w:t>
+      </w:r>
+    </w:p>
+    <w:p>
+      <w:r>
+        <w:br w:type="page"/>
+      </w:r>
+    </w:p>
+    <w:p>
+      <w:pPr>
+        <w:pStyle w:val="Heading1"/>
+      </w:pPr>
+      <w:r>
+        <w:t>05  Existing solutions and alternatives</w:t>
       </w:r>
     </w:p>
     <w:p>
@@ -1546,7 +1970,7 @@
               <w:bottom w:w="105" w:type="dxa"/>
               <w:right w:w="105" w:type="dxa"/>
             </w:tcMar>
-            <w:shd w:fill="233F35"/>
+            <w:shd w:fill="233746"/>
           </w:tcPr>
           <w:p>
             <w:pPr>
@@ -1578,7 +2002,7 @@
               <w:bottom w:w="105" w:type="dxa"/>
               <w:right w:w="105" w:type="dxa"/>
             </w:tcMar>
-            <w:shd w:fill="233F35"/>
+            <w:shd w:fill="233746"/>
           </w:tcPr>
           <w:p>
             <w:pPr>
@@ -1610,7 +2034,7 @@
               <w:bottom w:w="105" w:type="dxa"/>
               <w:right w:w="105" w:type="dxa"/>
             </w:tcMar>
-            <w:shd w:fill="233F35"/>
+            <w:shd w:fill="233746"/>
           </w:tcPr>
           <w:p>
             <w:pPr>
@@ -1642,7 +2066,7 @@
               <w:bottom w:w="105" w:type="dxa"/>
               <w:right w:w="105" w:type="dxa"/>
             </w:tcMar>
-            <w:shd w:fill="233F35"/>
+            <w:shd w:fill="233746"/>
           </w:tcPr>
           <w:p>
             <w:pPr>
@@ -2770,7 +3194,7 @@
         <w:pStyle w:val="Heading1"/>
       </w:pPr>
       <w:r>
-        <w:t>05  Technology decisions</w:t>
+        <w:t>06  Technology decisions</w:t>
       </w:r>
     </w:p>
     <w:p>
@@ -2811,7 +3235,7 @@
               <w:bottom w:w="105" w:type="dxa"/>
               <w:right w:w="105" w:type="dxa"/>
             </w:tcMar>
-            <w:shd w:fill="233F35"/>
+            <w:shd w:fill="233746"/>
           </w:tcPr>
           <w:p>
             <w:pPr>
@@ -2843,7 +3267,7 @@
               <w:bottom w:w="105" w:type="dxa"/>
               <w:right w:w="105" w:type="dxa"/>
             </w:tcMar>
-            <w:shd w:fill="233F35"/>
+            <w:shd w:fill="233746"/>
           </w:tcPr>
           <w:p>
             <w:pPr>
@@ -2875,7 +3299,7 @@
               <w:bottom w:w="105" w:type="dxa"/>
               <w:right w:w="105" w:type="dxa"/>
             </w:tcMar>
-            <w:shd w:fill="233F35"/>
+            <w:shd w:fill="233746"/>
           </w:tcPr>
           <w:p>
             <w:pPr>
@@ -3835,7 +4259,7 @@
         <w:pStyle w:val="Heading1"/>
       </w:pPr>
       <w:r>
-        <w:t>06  Functional requirements</w:t>
+        <w:t>07  Functional requirements</w:t>
       </w:r>
     </w:p>
     <w:p>
@@ -3876,7 +4300,7 @@
               <w:bottom w:w="105" w:type="dxa"/>
               <w:right w:w="105" w:type="dxa"/>
             </w:tcMar>
-            <w:shd w:fill="233F35"/>
+            <w:shd w:fill="233746"/>
           </w:tcPr>
           <w:p>
             <w:pPr>
@@ -3909,7 +4333,7 @@
               <w:bottom w:w="105" w:type="dxa"/>
               <w:right w:w="105" w:type="dxa"/>
             </w:tcMar>
-            <w:shd w:fill="233F35"/>
+            <w:shd w:fill="233746"/>
           </w:tcPr>
           <w:p>
             <w:pPr>
@@ -3942,7 +4366,7 @@
               <w:bottom w:w="105" w:type="dxa"/>
               <w:right w:w="105" w:type="dxa"/>
             </w:tcMar>
-            <w:shd w:fill="233F35"/>
+            <w:shd w:fill="233746"/>
           </w:tcPr>
           <w:p>
             <w:pPr>
@@ -5031,7 +5455,7 @@
         <w:pStyle w:val="Heading1"/>
       </w:pPr>
       <w:r>
-        <w:t>07  Quality and protection requirements</w:t>
+        <w:t>08  Quality and protection requirements</w:t>
       </w:r>
     </w:p>
     <w:p>
@@ -5072,7 +5496,7 @@
               <w:bottom w:w="105" w:type="dxa"/>
               <w:right w:w="105" w:type="dxa"/>
             </w:tcMar>
-            <w:shd w:fill="233F35"/>
+            <w:shd w:fill="233746"/>
           </w:tcPr>
           <w:p>
             <w:pPr>
@@ -5105,7 +5529,7 @@
               <w:bottom w:w="105" w:type="dxa"/>
               <w:right w:w="105" w:type="dxa"/>
             </w:tcMar>
-            <w:shd w:fill="233F35"/>
+            <w:shd w:fill="233746"/>
           </w:tcPr>
           <w:p>
             <w:pPr>
@@ -5138,7 +5562,7 @@
               <w:bottom w:w="105" w:type="dxa"/>
               <w:right w:w="105" w:type="dxa"/>
             </w:tcMar>
-            <w:shd w:fill="233F35"/>
+            <w:shd w:fill="233746"/>
           </w:tcPr>
           <w:p>
             <w:pPr>
@@ -6026,7 +6450,7 @@
         <w:pStyle w:val="Heading1"/>
       </w:pPr>
       <w:r>
-        <w:t>08  System context</w:t>
+        <w:t>09  System context</w:t>
       </w:r>
     </w:p>
     <w:p>
@@ -6110,7 +6534,7 @@
         <w:pStyle w:val="Heading1"/>
       </w:pPr>
       <w:r>
-        <w:t>09  Principal use cases</w:t>
+        <w:t>10  Principal use cases</w:t>
       </w:r>
     </w:p>
     <w:p>
@@ -6202,7 +6626,7 @@
         <w:pStyle w:val="Heading1"/>
       </w:pPr>
       <w:r>
-        <w:t>10  Component architecture</w:t>
+        <w:t>11  Component architecture</w:t>
       </w:r>
     </w:p>
     <w:p>
@@ -6273,7 +6697,7 @@
         <w:pStyle w:val="Heading1"/>
       </w:pPr>
       <w:r>
-        <w:t>11  Guest experience</w:t>
+        <w:t>12  Guest experience</w:t>
       </w:r>
     </w:p>
     <w:p>
@@ -6357,7 +6781,7 @@
         <w:pStyle w:val="Heading1"/>
       </w:pPr>
       <w:r>
-        <w:t>12  Staff experience</w:t>
+        <w:t>13  Staff experience</w:t>
       </w:r>
     </w:p>
     <w:p>
@@ -6441,7 +6865,7 @@
         <w:pStyle w:val="Heading1"/>
       </w:pPr>
       <w:r>
-        <w:t>13  Owner overview</w:t>
+        <w:t>14  Owner overview</w:t>
       </w:r>
     </w:p>
     <w:p>
@@ -6529,7 +6953,7 @@
               <w:bottom w:w="105" w:type="dxa"/>
               <w:right w:w="105" w:type="dxa"/>
             </w:tcMar>
-            <w:shd w:fill="233F35"/>
+            <w:shd w:fill="233746"/>
           </w:tcPr>
           <w:p>
             <w:pPr>
@@ -6561,7 +6985,7 @@
               <w:bottom w:w="105" w:type="dxa"/>
               <w:right w:w="105" w:type="dxa"/>
             </w:tcMar>
-            <w:shd w:fill="233F35"/>
+            <w:shd w:fill="233746"/>
           </w:tcPr>
           <w:p>
             <w:pPr>
@@ -6880,7 +7304,7 @@
         <w:pStyle w:val="Heading1"/>
       </w:pPr>
       <w:r>
-        <w:t>14  Administrator access</w:t>
+        <w:t>15  Administrator access</w:t>
       </w:r>
     </w:p>
     <w:p>
@@ -6985,7 +7409,7 @@
         <w:pStyle w:val="Heading1"/>
       </w:pPr>
       <w:r>
-        <w:t>15  Evaluation method</w:t>
+        <w:t>16  Evaluation method</w:t>
       </w:r>
     </w:p>
     <w:p>
@@ -7026,7 +7450,7 @@
               <w:bottom w:w="105" w:type="dxa"/>
               <w:right w:w="105" w:type="dxa"/>
             </w:tcMar>
-            <w:shd w:fill="233F35"/>
+            <w:shd w:fill="233746"/>
           </w:tcPr>
           <w:p>
             <w:pPr>
@@ -7058,7 +7482,7 @@
               <w:bottom w:w="105" w:type="dxa"/>
               <w:right w:w="105" w:type="dxa"/>
             </w:tcMar>
-            <w:shd w:fill="233F35"/>
+            <w:shd w:fill="233746"/>
           </w:tcPr>
           <w:p>
             <w:pPr>
@@ -7090,7 +7514,7 @@
               <w:bottom w:w="105" w:type="dxa"/>
               <w:right w:w="105" w:type="dxa"/>
             </w:tcMar>
-            <w:shd w:fill="233F35"/>
+            <w:shd w:fill="233746"/>
           </w:tcPr>
           <w:p>
             <w:pPr>
@@ -7755,7 +8179,7 @@
         <w:pStyle w:val="Heading1"/>
       </w:pPr>
       <w:r>
-        <w:t>16  Work plan and collaboration</w:t>
+        <w:t>17  Work plan and collaboration</w:t>
       </w:r>
     </w:p>
     <w:p>
@@ -7796,7 +8220,7 @@
               <w:bottom w:w="105" w:type="dxa"/>
               <w:right w:w="105" w:type="dxa"/>
             </w:tcMar>
-            <w:shd w:fill="233F35"/>
+            <w:shd w:fill="233746"/>
           </w:tcPr>
           <w:p>
             <w:pPr>
@@ -7828,7 +8252,7 @@
               <w:bottom w:w="105" w:type="dxa"/>
               <w:right w:w="105" w:type="dxa"/>
             </w:tcMar>
-            <w:shd w:fill="233F35"/>
+            <w:shd w:fill="233746"/>
           </w:tcPr>
           <w:p>
             <w:pPr>
@@ -7860,7 +8284,7 @@
               <w:bottom w:w="105" w:type="dxa"/>
               <w:right w:w="105" w:type="dxa"/>
             </w:tcMar>
-            <w:shd w:fill="233F35"/>
+            <w:shd w:fill="233746"/>
           </w:tcPr>
           <w:p>
             <w:pPr>
@@ -8764,7 +9188,7 @@
         <w:pStyle w:val="Heading1"/>
       </w:pPr>
       <w:r>
-        <w:t>17  Submission status and next steps</w:t>
+        <w:t>18  Submission status and next steps</w:t>
       </w:r>
     </w:p>
     <w:p>
@@ -8805,7 +9229,7 @@
               <w:bottom w:w="105" w:type="dxa"/>
               <w:right w:w="105" w:type="dxa"/>
             </w:tcMar>
-            <w:shd w:fill="233F35"/>
+            <w:shd w:fill="233746"/>
           </w:tcPr>
           <w:p>
             <w:pPr>
@@ -8837,7 +9261,7 @@
               <w:bottom w:w="105" w:type="dxa"/>
               <w:right w:w="105" w:type="dxa"/>
             </w:tcMar>
-            <w:shd w:fill="233F35"/>
+            <w:shd w:fill="233746"/>
           </w:tcPr>
           <w:p>
             <w:pPr>
@@ -8869,7 +9293,7 @@
               <w:bottom w:w="105" w:type="dxa"/>
               <w:right w:w="105" w:type="dxa"/>
             </w:tcMar>
-            <w:shd w:fill="233F35"/>
+            <w:shd w:fill="233746"/>
           </w:tcPr>
           <w:p>
             <w:pPr>
@@ -8950,7 +9374,7 @@
                 <w:color w:val="172D29"/>
                 <w:sz w:val="18"/>
               </w:rPr>
-              <w:t>Pages 1–2 and 17</w:t>
+              <w:t>Pages 1–2 and 18</w:t>
             </w:r>
           </w:p>
         </w:tc>
@@ -9051,7 +9475,7 @@
                 <w:color w:val="172D29"/>
                 <w:sz w:val="18"/>
               </w:rPr>
-              <w:t>Plan on page 16; recording form on page 21</w:t>
+              <w:t>Plan on page 17; AI scenarios in Appendix A</w:t>
             </w:r>
           </w:p>
         </w:tc>
@@ -9152,7 +9576,7 @@
                 <w:color w:val="172D29"/>
                 <w:sz w:val="18"/>
               </w:rPr>
-              <w:t>8 studies and 14 official sources; pages 3–6 and 19–20</w:t>
+              <w:t>12 scientific studies plus 14 official sources; pages 20–22</w:t>
             </w:r>
           </w:p>
         </w:tc>
@@ -9960,7 +10384,7 @@
                 <w:color w:val="172D29"/>
                 <w:sz w:val="18"/>
               </w:rPr>
-              <w:t>Review questions and response form on page 22</w:t>
+              <w:t>Teacher comment and response on page 26; adviser role-play separately labelled</w:t>
             </w:r>
           </w:p>
         </w:tc>
@@ -9992,7 +10416,7 @@
                 <w:color w:val="172D29"/>
                 <w:sz w:val="18"/>
               </w:rPr>
-              <w:t>Not yet received</w:t>
+              <w:t>Comment received; approval pending</w:t>
             </w:r>
           </w:p>
         </w:tc>
@@ -10013,7 +10437,7 @@
     </w:p>
     <w:p>
       <w:r>
-        <w:t>Send the report and prototype for substantive supervisor comments. Ask whether the proposed scope, evidence and acceptance method meet the milestone. Obtain real user discussions, record observations and revise the problem statement where necessary. AI role scenarios may support preparation, but must not be presented as interviews.</w:t>
+        <w:t>The teacher requested at least 12 sources and more substantive presentation. This revision adds four scientific studies, thematic synthesis and traceable design decisions. Appendix A contains permitted AI role-play for requirements exploration; it supplies no real participant evidence. Ask the supervisor to confirm whether that exercise is acceptable for this milestone before treating the user-discussion criterion as satisfied.</w:t>
       </w:r>
     </w:p>
     <w:p>
@@ -10036,12 +10460,12 @@
         <w:pStyle w:val="Heading1"/>
       </w:pPr>
       <w:r>
-        <w:t>18  Scientific references</w:t>
+        <w:t>19  Scientific references</w:t>
       </w:r>
     </w:p>
     <w:p>
       <w:r>
-        <w:t>Source access was documented on 24 October 2026. Access limitations and project implications are discussed on pages 3–4.</w:t>
+        <w:t>Source access was documented on 24 October 2026. Access limitations and project implications are discussed on pages 3–5.</w:t>
       </w:r>
     </w:p>
     <w:p>
@@ -10189,6 +10613,24 @@
       </w:hyperlink>
     </w:p>
     <w:p>
+      <w:r>
+        <w:br w:type="page"/>
+      </w:r>
+    </w:p>
+    <w:p>
+      <w:pPr>
+        <w:pStyle w:val="Heading1"/>
+      </w:pPr>
+      <w:r>
+        <w:t>Scientific references continued</w:t>
+      </w:r>
+    </w:p>
+    <w:p>
+      <w:r>
+        <w:t>Sources S7–S12. DOI links identify the published articles; access may require a university subscription.</w:t>
+      </w:r>
+    </w:p>
+    <w:p>
       <w:pPr>
         <w:spacing w:after="40"/>
       </w:pPr>
@@ -10237,6 +10679,102 @@
       </w:hyperlink>
     </w:p>
     <w:p>
+      <w:pPr>
+        <w:spacing w:after="40"/>
+      </w:pPr>
+      <w:r>
+        <w:rPr>
+          <w:sz w:val="18"/>
+        </w:rPr>
+        <w:t>[S9] Dorotic, M., Bijmolt, T. H. A., &amp; Verhoef, P. C. (2012). Loyalty programmes: Current knowledge and research directions. International Journal of Management Reviews, 14(3), 217–237.</w:t>
+      </w:r>
+    </w:p>
+    <w:p>
+      <w:pPr>
+        <w:spacing w:after="100"/>
+      </w:pPr>
+      <w:hyperlink r:id="rId26">
+        <w:r>
+          <w:rPr>
+            <w:color w:val="126C58"/>
+          </w:rPr>
+          <w:t>DOI  https://doi.org/10.1111/j.1468-2370.2011.00314.x</w:t>
+        </w:r>
+      </w:hyperlink>
+    </w:p>
+    <w:p>
+      <w:pPr>
+        <w:spacing w:after="40"/>
+      </w:pPr>
+      <w:r>
+        <w:rPr>
+          <w:sz w:val="18"/>
+        </w:rPr>
+        <w:t>[S10] Leenheer, J., van Heerde, H. J., Bijmolt, T. H. A., &amp; Smidts, A. (2007). Do loyalty programs really enhance behavioral loyalty? An empirical analysis accounting for self-selecting members. International Journal of Research in Marketing, 24(1), 31–47.</w:t>
+      </w:r>
+    </w:p>
+    <w:p>
+      <w:pPr>
+        <w:spacing w:after="100"/>
+      </w:pPr>
+      <w:hyperlink r:id="rId27">
+        <w:r>
+          <w:rPr>
+            <w:color w:val="126C58"/>
+          </w:rPr>
+          <w:t>DOI  https://doi.org/10.1016/j.ijresmar.2006.10.005</w:t>
+        </w:r>
+      </w:hyperlink>
+    </w:p>
+    <w:p>
+      <w:pPr>
+        <w:spacing w:after="40"/>
+      </w:pPr>
+      <w:r>
+        <w:rPr>
+          <w:sz w:val="18"/>
+        </w:rPr>
+        <w:t>[S11] Liu, Y. (2007). The long-term impact of loyalty programs on consumer purchase behavior and loyalty. Journal of Marketing, 71(4), 19–35.</w:t>
+      </w:r>
+    </w:p>
+    <w:p>
+      <w:pPr>
+        <w:spacing w:after="100"/>
+      </w:pPr>
+      <w:hyperlink r:id="rId28">
+        <w:r>
+          <w:rPr>
+            <w:color w:val="126C58"/>
+          </w:rPr>
+          <w:t>DOI  https://doi.org/10.1509/jmkg.71.4.019</w:t>
+        </w:r>
+      </w:hyperlink>
+    </w:p>
+    <w:p>
+      <w:pPr>
+        <w:spacing w:after="40"/>
+      </w:pPr>
+      <w:r>
+        <w:rPr>
+          <w:sz w:val="18"/>
+        </w:rPr>
+        <w:t>[S12] Nunes, J. C., &amp; Drèze, X. (2006). The endowed progress effect: How artificial advancement increases effort. Journal of Consumer Research, 32(4), 504–512.</w:t>
+      </w:r>
+    </w:p>
+    <w:p>
+      <w:pPr>
+        <w:spacing w:after="100"/>
+      </w:pPr>
+      <w:hyperlink r:id="rId29">
+        <w:r>
+          <w:rPr>
+            <w:color w:val="126C58"/>
+          </w:rPr>
+          <w:t>DOI  https://doi.org/10.1086/500480</w:t>
+        </w:r>
+      </w:hyperlink>
+    </w:p>
+    <w:p>
       <w:r>
         <w:br w:type="page"/>
       </w:r>
@@ -10246,7 +10784,7 @@
         <w:pStyle w:val="Heading1"/>
       </w:pPr>
       <w:r>
-        <w:t>19  Product and technical sources</w:t>
+        <w:t>20  Product and technical sources</w:t>
       </w:r>
     </w:p>
     <w:p>
@@ -10270,7 +10808,7 @@
       <w:pPr>
         <w:spacing w:after="100"/>
       </w:pPr>
-      <w:hyperlink r:id="rId26">
+      <w:hyperlink r:id="rId30">
         <w:r>
           <w:rPr>
             <w:color w:val="126C58"/>
@@ -10295,7 +10833,7 @@
       <w:pPr>
         <w:spacing w:after="100"/>
       </w:pPr>
-      <w:hyperlink r:id="rId27">
+      <w:hyperlink r:id="rId31">
         <w:r>
           <w:rPr>
             <w:color w:val="126C58"/>
@@ -10320,7 +10858,7 @@
       <w:pPr>
         <w:spacing w:after="100"/>
       </w:pPr>
-      <w:hyperlink r:id="rId28">
+      <w:hyperlink r:id="rId32">
         <w:r>
           <w:rPr>
             <w:color w:val="126C58"/>
@@ -10345,7 +10883,7 @@
       <w:pPr>
         <w:spacing w:after="100"/>
       </w:pPr>
-      <w:hyperlink r:id="rId29">
+      <w:hyperlink r:id="rId33">
         <w:r>
           <w:rPr>
             <w:color w:val="126C58"/>
@@ -10370,7 +10908,7 @@
       <w:pPr>
         <w:spacing w:after="100"/>
       </w:pPr>
-      <w:hyperlink r:id="rId30">
+      <w:hyperlink r:id="rId34">
         <w:r>
           <w:rPr>
             <w:color w:val="126C58"/>
@@ -10395,7 +10933,7 @@
       <w:pPr>
         <w:spacing w:after="100"/>
       </w:pPr>
-      <w:hyperlink r:id="rId31">
+      <w:hyperlink r:id="rId35">
         <w:r>
           <w:rPr>
             <w:color w:val="126C58"/>
@@ -10420,7 +10958,7 @@
       <w:pPr>
         <w:spacing w:after="100"/>
       </w:pPr>
-      <w:hyperlink r:id="rId32">
+      <w:hyperlink r:id="rId36">
         <w:r>
           <w:rPr>
             <w:color w:val="126C58"/>
@@ -10445,7 +10983,7 @@
       <w:pPr>
         <w:spacing w:after="100"/>
       </w:pPr>
-      <w:hyperlink r:id="rId33">
+      <w:hyperlink r:id="rId37">
         <w:r>
           <w:rPr>
             <w:color w:val="126C58"/>
@@ -10470,7 +11008,7 @@
       <w:pPr>
         <w:spacing w:after="100"/>
       </w:pPr>
-      <w:hyperlink r:id="rId34">
+      <w:hyperlink r:id="rId38">
         <w:r>
           <w:rPr>
             <w:color w:val="126C58"/>
@@ -10495,7 +11033,7 @@
       <w:pPr>
         <w:spacing w:after="100"/>
       </w:pPr>
-      <w:hyperlink r:id="rId35">
+      <w:hyperlink r:id="rId39">
         <w:r>
           <w:rPr>
             <w:color w:val="126C58"/>
@@ -10520,7 +11058,7 @@
       <w:pPr>
         <w:spacing w:after="100"/>
       </w:pPr>
-      <w:hyperlink r:id="rId36">
+      <w:hyperlink r:id="rId40">
         <w:r>
           <w:rPr>
             <w:color w:val="126C58"/>
@@ -10545,7 +11083,7 @@
       <w:pPr>
         <w:spacing w:after="100"/>
       </w:pPr>
-      <w:hyperlink r:id="rId37">
+      <w:hyperlink r:id="rId41">
         <w:r>
           <w:rPr>
             <w:color w:val="126C58"/>
@@ -10570,7 +11108,7 @@
       <w:pPr>
         <w:spacing w:after="100"/>
       </w:pPr>
-      <w:hyperlink r:id="rId38">
+      <w:hyperlink r:id="rId42">
         <w:r>
           <w:rPr>
             <w:color w:val="126C58"/>
@@ -10595,7 +11133,7 @@
       <w:pPr>
         <w:spacing w:after="100"/>
       </w:pPr>
-      <w:hyperlink r:id="rId39">
+      <w:hyperlink r:id="rId43">
         <w:r>
           <w:rPr>
             <w:color w:val="126C58"/>
@@ -10616,7 +11154,7 @@
       <w:pPr>
         <w:spacing w:after="100"/>
       </w:pPr>
-      <w:hyperlink r:id="rId40">
+      <w:hyperlink r:id="rId44">
         <w:r>
           <w:rPr>
             <w:color w:val="126C58"/>
@@ -10629,7 +11167,7 @@
       <w:pPr>
         <w:spacing w:after="100"/>
       </w:pPr>
-      <w:hyperlink r:id="rId41">
+      <w:hyperlink r:id="rId45">
         <w:r>
           <w:rPr>
             <w:color w:val="126C58"/>
@@ -10656,12 +11194,17 @@
         <w:pStyle w:val="Heading1"/>
       </w:pPr>
       <w:r>
-        <w:t>Appendix A  User discussions</w:t>
+        <w:t>Appendix A  Simulated owner discussion</w:t>
       </w:r>
     </w:p>
     <w:p>
       <w:r>
-        <w:t>Research protocol and recording form. No participant responses have been collected for this submission.</w:t>
+        <w:t>AI-generated design exercise. The characters and situations are fictional; no interview took place.</w:t>
+      </w:r>
+    </w:p>
+    <w:p>
+      <w:r>
+        <w:t>The exercise uses the four-role concept and a six-visit reward rule to expose objections before implementation. The team requested realistic role-play, including disagreement, rather than favourable testimonials. The dialogues are presented in English for this report. They are not translated interview transcripts, a participant sample or evidence of willingness to pay.</w:t>
       </w:r>
     </w:p>
     <w:p>
@@ -10669,12 +11212,57 @@
         <w:pStyle w:val="Heading2"/>
       </w:pPr>
       <w:r>
-        <w:t>Recruitment and procedure</w:t>
+        <w:t>Scenario A1  A coffee shop owner</w:t>
       </w:r>
     </w:p>
     <w:p>
       <w:r>
-        <w:t>Invite 3–5 owners or staff members from independent coffee shops, bakeries or salons. Explain the diploma study and request permission to take anonymised notes. Ask about recent behaviour before showing the prototype. Record disagreement and existing solutions as carefully as positive reactions. Participation does not imply a purchase commitment.</w:t>
+        <w:t>Student: Before I show the screens, how would you handle a guest who says they lost a nearly completed paper card?</w:t>
+      </w:r>
+    </w:p>
+    <w:p>
+      <w:r>
+        <w:t>Owner role: If I recognise them, I might accept what they say. But the next person on shift may not know them. I would not want a new system to turn that argument into a longer queue.</w:t>
+      </w:r>
+    </w:p>
+    <w:p>
+      <w:r>
+        <w:t>Student: Would a history of confirmed visits help?</w:t>
+      </w:r>
+    </w:p>
+    <w:p>
+      <w:r>
+        <w:t>Owner role: Maybe. Who corrects a mistake? A cashier can scan the wrong person, especially when two customers are standing together.</w:t>
+      </w:r>
+    </w:p>
+    <w:p>
+      <w:r>
+        <w:t>Student: We propose showing the matched card before confirmation. An authorised correction would leave an audit record instead of deleting the event.</w:t>
+      </w:r>
+    </w:p>
+    <w:p>
+      <w:r>
+        <w:t>Owner role: That sounds useful, but I still need to see how many steps it takes. My current cards do not need a charged phone or a password.</w:t>
+      </w:r>
+    </w:p>
+    <w:p>
+      <w:r>
+        <w:t>Student: What would you need to see before choosing whether to continue after a trial?</w:t>
+      </w:r>
+    </w:p>
+    <w:p>
+      <w:r>
+        <w:t>Owner role: That the staff can use it without calling me, that the numbers make sense, and that I can take my records if I leave. A pretty graph is not enough.</w:t>
+      </w:r>
+    </w:p>
+    <w:p>
+      <w:r>
+        <w:t>Student: Is seven days enough to judge it?</w:t>
+      </w:r>
+    </w:p>
+    <w:p>
+      <w:r>
+        <w:t>Owner role: To find annoying parts, probably. To say that people return more often, no. Some regulars might only visit once that week.</w:t>
       </w:r>
     </w:p>
     <w:p>
@@ -10682,98 +11270,12 @@
         <w:pStyle w:val="Heading2"/>
       </w:pPr>
       <w:r>
-        <w:t>Questions about past behaviour</w:t>
-      </w:r>
-    </w:p>
-    <w:p>
-      <w:pPr>
-        <w:pStyle w:val="ListBullet"/>
-      </w:pPr>
-      <w:r>
-        <w:t>Describe the last time you recorded a repeat visit or issued a loyalty reward. What happened from start to finish?</w:t>
-      </w:r>
-    </w:p>
-    <w:p>
-      <w:pPr>
-        <w:pStyle w:val="ListBullet"/>
-      </w:pPr>
-      <w:r>
-        <w:t>What tool or record did you use, and what happened when a card was lost or a reward was disputed?</w:t>
-      </w:r>
-    </w:p>
-    <w:p>
-      <w:pPr>
-        <w:pStyle w:val="ListBullet"/>
-      </w:pPr>
-      <w:r>
-        <w:t>How much staff time or money did the last such case require? How did you estimate it?</w:t>
-      </w:r>
-    </w:p>
-    <w:p>
-      <w:pPr>
-        <w:pStyle w:val="ListBullet"/>
-      </w:pPr>
-      <w:r>
-        <w:t>Which other solutions have you tried or rejected? What determined that decision?</w:t>
-      </w:r>
-    </w:p>
-    <w:p>
-      <w:pPr>
-        <w:pStyle w:val="ListBullet"/>
-      </w:pPr>
-      <w:r>
-        <w:t>Who approved the current process, and how was the budget or responsibility agreed?</w:t>
-      </w:r>
-    </w:p>
-    <w:p>
-      <w:pPr>
-        <w:pStyle w:val="Heading2"/>
-      </w:pPr>
-      <w:r>
-        <w:t>Record one discussion</w:t>
+        <w:t>Candidate requirements and unresolved questions</w:t>
       </w:r>
     </w:p>
     <w:p>
       <w:r>
-        <w:t>Participant code: ____________________    Date: ____________________</w:t>
-        <w:br/>
-        <w:t>Role and business type: __________________________________________</w:t>
-        <w:br/>
-        <w:t>Consent to anonymised notes: ____________________________________</w:t>
-      </w:r>
-    </w:p>
-    <w:p>
-      <w:r>
-        <w:t>Recent situation and current workaround:</w:t>
-        <w:br/>
-        <w:t>________________________________________________________________</w:t>
-        <w:br/>
-        <w:t>________________________________________________________________</w:t>
-      </w:r>
-    </w:p>
-    <w:p>
-      <w:r>
-        <w:t>Observed cost, frequency or consequences, with the participant’s basis:</w:t>
-        <w:br/>
-        <w:t>________________________________________________________________</w:t>
-        <w:br/>
-        <w:t>________________________________________________________________</w:t>
-      </w:r>
-    </w:p>
-    <w:p>
-      <w:r>
-        <w:t>Evidence that supports or challenges the proposed problem:</w:t>
-        <w:br/>
-        <w:t>________________________________________________________________</w:t>
-        <w:br/>
-        <w:t>________________________________________________________________</w:t>
-      </w:r>
-    </w:p>
-    <w:p>
-      <w:r>
-        <w:t>Resulting requirement or scope change and task link:</w:t>
-        <w:br/>
-        <w:t>________________________________________________________________</w:t>
+        <w:t>This scenario motivates a visible confirmation step, an auditable correction and a usable export. It also separates the access trial from the time needed to evaluate retention. The existing requirements FR-03 and FR-06 cover transaction correctness and metrics; correction permissions and export scope still need specification.</w:t>
       </w:r>
     </w:p>
     <w:p>
@@ -10781,7 +11283,7 @@
         <w:pStyle w:val="Caption"/>
       </w:pPr>
       <w:r>
-        <w:t>Completion rule: retain anonymised notes for each actual discussion, distinguish quotations from interpretation, and summarise both recurring patterns and contradictory observations. Keep contact details and raw personal data outside the repository. An AI role simulation is not an interview.</w:t>
+        <w:t>Validation to obtain: observe a real shift, record the current lost-card procedure and test a mistaken visit on synthetic data. No operational frequency, acceptable price or customer benefit can be inferred from this role-play.</w:t>
       </w:r>
     </w:p>
     <w:p>
@@ -10794,12 +11296,12 @@
         <w:pStyle w:val="Heading1"/>
       </w:pPr>
       <w:r>
-        <w:t>Appendix B  Supervisor feedback</w:t>
+        <w:t>Appendix A  Simulated staff discussion</w:t>
       </w:r>
     </w:p>
     <w:p>
       <w:r>
-        <w:t>Review request and response log. Substantive supervisor feedback on this package has not yet been received.</w:t>
+        <w:t>AI-generated role-play A2. This is a fictional counter scenario, not a report of observed staff behaviour.</w:t>
       </w:r>
     </w:p>
     <w:p>
@@ -10807,47 +11309,57 @@
         <w:pStyle w:val="Heading2"/>
       </w:pPr>
       <w:r>
-        <w:t>Questions for the supervisor</w:t>
+        <w:t>Scenario A2  A cashier during a busy shift</w:t>
       </w:r>
     </w:p>
     <w:p>
-      <w:pPr>
-        <w:pStyle w:val="ListBullet"/>
-      </w:pPr>
       <w:r>
-        <w:t>Is the problem statement and proposed contribution appropriate for this diploma topic?</w:t>
+        <w:t>Student: The guest has five visits out of six. You scan the card and press Confirm visit. The connection drops before the result appears. What would you do?</w:t>
       </w:r>
     </w:p>
     <w:p>
-      <w:pPr>
-        <w:pStyle w:val="ListBullet"/>
-      </w:pPr>
       <w:r>
-        <w:t>Is the four-role scope feasible for two students, and which features should be deferred?</w:t>
+        <w:t>Staff role: I would probably press it again. The guest is waiting and I cannot tell whether it worked.</w:t>
       </w:r>
     </w:p>
     <w:p>
-      <w:pPr>
-        <w:pStyle w:val="ListBullet"/>
-      </w:pPr>
       <w:r>
-        <w:t>Are the literature review, comparisons and source-access limitations sufficient for the first milestone?</w:t>
+        <w:t>Student: The same operation should return the earlier result if the first request committed. Until we know the result, the screen should say it is being checked.</w:t>
       </w:r>
     </w:p>
     <w:p>
-      <w:pPr>
-        <w:pStyle w:val="ListBullet"/>
-      </w:pPr>
       <w:r>
-        <w:t>Are the proposed usability, isolation, concurrency and recovery checks suitable for evaluating the work?</w:t>
+        <w:t>Staff role: Then do not just show a red error. I will read that as “nothing happened”. And where do I look to check the last visit?</w:t>
       </w:r>
     </w:p>
     <w:p>
-      <w:pPr>
-        <w:pStyle w:val="ListBullet"/>
-      </w:pPr>
       <w:r>
-        <w:t>Which revisions and evidence are required before acceptance, and what is the next agreed deadline?</w:t>
+        <w:t>Student: We need a recent-operation result with the time and resulting progress. Would you issue the free coffee as soon as it reaches six?</w:t>
+      </w:r>
+    </w:p>
+    <w:p>
+      <w:r>
+        <w:t>Staff role: Only if the guest wants it now. They may want to keep the reward for next time. Also, I need to know whether it was already used at the other branch.</w:t>
+      </w:r>
+    </w:p>
+    <w:p>
+      <w:r>
+        <w:t>Student: Redemption is a separate action. The server checks the available reward and records one redemption, even if two staff members submit it.</w:t>
+      </w:r>
+    </w:p>
+    <w:p>
+      <w:r>
+        <w:t>Staff role: What if I scan a card from another café in the same wallet?</w:t>
+      </w:r>
+    </w:p>
+    <w:p>
+      <w:r>
+        <w:t>Student: It should say that this card belongs to another business and cannot be used here. It must not reveal that business’s customer history.</w:t>
+      </w:r>
+    </w:p>
+    <w:p>
+      <w:r>
+        <w:t>Staff role: Good. But do not make me log in again after every customer. I need an individual account that stays usable during my shift, and a clear way to lock it when I leave.</w:t>
       </w:r>
     </w:p>
     <w:p>
@@ -10855,45 +11367,38 @@
         <w:pStyle w:val="Heading2"/>
       </w:pPr>
       <w:r>
-        <w:t>Record feedback after the review</w:t>
+        <w:t>Candidate requirements and test cases</w:t>
       </w:r>
     </w:p>
     <w:p>
       <w:r>
-        <w:t>Review date and reviewed revision: ________________________________</w:t>
-        <w:br/>
-        <w:t>Reviewer name: _________________________________________________</w:t>
-        <w:br/>
-        <w:t>Feedback source or meeting reference: _____________________________</w:t>
+        <w:t>FR-02, FR-03 and FR-08 cover company boundaries, single-effect writes and staff scope. Add an uncertain-result state to P03, a recent-operation lookup and explicit lock/logout behaviour. A proposed acceptance test drops the response after commit, retries with the same idempotency key and checks that one visit and one reward entitlement exist.</w:t>
+      </w:r>
+    </w:p>
+    <w:p>
+      <w:pPr>
+        <w:pStyle w:val="Caption"/>
+      </w:pPr>
+      <w:r>
+        <w:t>The simulated cashier’s tendency to retry is a scenario assumption. Usability testing must establish whether the wording actually prevents an incorrect second action; a server-side duplicate test alone cannot establish that.</w:t>
       </w:r>
     </w:p>
     <w:p>
       <w:r>
-        <w:t>Comment in the reviewer’s words or a confirmed summary:</w:t>
-        <w:br/>
-        <w:t>________________________________________________________________</w:t>
-        <w:br/>
-        <w:t>________________________________________________________________</w:t>
-        <w:br/>
-        <w:t>________________________________________________________________</w:t>
+        <w:br w:type="page"/>
+      </w:r>
+    </w:p>
+    <w:p>
+      <w:pPr>
+        <w:pStyle w:val="Heading1"/>
+      </w:pPr>
+      <w:r>
+        <w:t>Appendix A  Simulated guest discussion</w:t>
       </w:r>
     </w:p>
     <w:p>
       <w:r>
-        <w:t>Team response and reason for the decision:</w:t>
-        <w:br/>
-        <w:t>________________________________________________________________</w:t>
-        <w:br/>
-        <w:t>________________________________________________________________</w:t>
-      </w:r>
-    </w:p>
-    <w:p>
-      <w:r>
-        <w:t>Responsible student and due date: _________________________________</w:t>
-        <w:br/>
-        <w:t>Task or change link: ______________________________________________</w:t>
-        <w:br/>
-        <w:t>Reviewer confirmation, if requested: _______________________________</w:t>
+        <w:t>AI-generated role-play A3. No real guest, account, visit history or consent record is represented.</w:t>
       </w:r>
     </w:p>
     <w:p>
@@ -10901,20 +11406,588 @@
         <w:pStyle w:val="Heading2"/>
       </w:pPr>
       <w:r>
-        <w:t>AI-assisted design questions for discussion</w:t>
+        <w:t>Scenario A3  A guest with several cards</w:t>
       </w:r>
     </w:p>
     <w:p>
       <w:r>
-        <w:t>These are preparation prompts generated during document drafting, not comments attributed to users or the supervisor: define what happens after trial expiry; distinguish repeat-guest share from retention; test uncertain outcomes after a network timeout; confirm the identity rule for linking several cards. Their relevance must be checked with the team and real participants.</w:t>
+        <w:t>Student: You have cards for a café and a salon. Would keeping both in one account make the next visit easier?</w:t>
       </w:r>
+    </w:p>
+    <w:p>
+      <w:r>
+        <w:t>Guest role: If I can find the right one quickly. I do not want the café to see when I visit the salon.</w:t>
+      </w:r>
+    </w:p>
+    <w:p>
+      <w:r>
+        <w:t>Student: The wallet groups cards for your access. Each business receives only its own card and activity. What would make you hesitate at registration?</w:t>
+      </w:r>
+    </w:p>
+    <w:p>
+      <w:r>
+        <w:t>Guest role: A long form. Also, why do you need my phone number? I do not want messages just because I want a stamp.</w:t>
+      </w:r>
+    </w:p>
+    <w:p>
+      <w:r>
+        <w:t>Student: The final registration flow needs a clear identity purpose and separate messaging choices. Which part of the sample card is unclear?</w:t>
+      </w:r>
+    </w:p>
+    <w:p>
+      <w:r>
+        <w:t>Guest role: “Six visits” could mean I get a free drink on the sixth visit or on the seventh. Say exactly when I can use it.</w:t>
+      </w:r>
+    </w:p>
+    <w:p>
+      <w:r>
+        <w:t>Student: The proposed rule creates a reward after the sixth qualifying visit. Using it is a separate step, subject to the stated programme conditions.</w:t>
+      </w:r>
+    </w:p>
+    <w:p>
+      <w:r>
+        <w:t>Guest role: And if I change my phone, do I lose all my cards?</w:t>
+      </w:r>
+    </w:p>
+    <w:p>
+      <w:r>
+        <w:t>Student: Recovery must verify that the account is yours. We should not merge two people just because somebody enters a matching phone number.</w:t>
+      </w:r>
+    </w:p>
+    <w:p>
+      <w:pPr>
+        <w:pStyle w:val="Heading2"/>
+      </w:pPr>
+      <w:r>
+        <w:t>Cross-scenario design actions</w:t>
+      </w:r>
+    </w:p>
+    <w:tbl>
+      <w:tblPr>
+        <w:tblW w:type="auto" w:w="0"/>
+        <w:jc w:val="center"/>
+        <w:tblLayout w:type="fixed"/>
+        <w:tblLook w:firstColumn="1" w:firstRow="1" w:lastColumn="0" w:lastRow="0" w:noHBand="0" w:noVBand="1" w:val="04A0"/>
+      </w:tblPr>
+      <w:tblGrid>
+        <w:gridCol w:w="1440"/>
+        <w:gridCol w:w="3888"/>
+        <w:gridCol w:w="4504"/>
+      </w:tblGrid>
+      <w:tr>
+        <w:trPr>
+          <w:cantSplit/>
+          <w:tblHeader/>
+        </w:trPr>
+        <w:tc>
+          <w:tcPr>
+            <w:tcW w:type="dxa" w:w="1440"/>
+            <w:vAlign w:val="center"/>
+            <w:tcBorders>
+              <w:top w:val="single" w:sz="4" w:color="D9D9D9"/>
+              <w:left w:val="single" w:sz="4" w:color="D9D9D9"/>
+              <w:bottom w:val="single" w:sz="4" w:color="D9D9D9"/>
+              <w:right w:val="single" w:sz="4" w:color="D9D9D9"/>
+            </w:tcBorders>
+            <w:tcMar>
+              <w:top w:w="105" w:type="dxa"/>
+              <w:left w:w="105" w:type="dxa"/>
+              <w:bottom w:w="105" w:type="dxa"/>
+              <w:right w:w="105" w:type="dxa"/>
+            </w:tcMar>
+            <w:shd w:fill="233746"/>
+          </w:tcPr>
+          <w:p>
+            <w:pPr>
+              <w:spacing w:after="0" w:line="259" w:lineRule="auto"/>
+            </w:pPr>
+            <w:r>
+              <w:rPr>
+                <w:b/>
+                <w:color w:val="FFFFFF"/>
+                <w:sz w:val="18"/>
+              </w:rPr>
+              <w:t>Scenario</w:t>
+            </w:r>
+          </w:p>
+        </w:tc>
+        <w:tc>
+          <w:tcPr>
+            <w:tcW w:type="dxa" w:w="3888"/>
+            <w:vAlign w:val="center"/>
+            <w:tcBorders>
+              <w:top w:val="single" w:sz="4" w:color="D9D9D9"/>
+              <w:left w:val="single" w:sz="4" w:color="D9D9D9"/>
+              <w:bottom w:val="single" w:sz="4" w:color="D9D9D9"/>
+              <w:right w:val="single" w:sz="4" w:color="D9D9D9"/>
+            </w:tcBorders>
+            <w:tcMar>
+              <w:top w:w="105" w:type="dxa"/>
+              <w:left w:w="105" w:type="dxa"/>
+              <w:bottom w:w="105" w:type="dxa"/>
+              <w:right w:w="105" w:type="dxa"/>
+            </w:tcMar>
+            <w:shd w:fill="233746"/>
+          </w:tcPr>
+          <w:p>
+            <w:pPr>
+              <w:spacing w:after="0" w:line="259" w:lineRule="auto"/>
+            </w:pPr>
+            <w:r>
+              <w:rPr>
+                <w:b/>
+                <w:color w:val="FFFFFF"/>
+                <w:sz w:val="18"/>
+              </w:rPr>
+              <w:t>Action to specify or test</w:t>
+            </w:r>
+          </w:p>
+        </w:tc>
+        <w:tc>
+          <w:tcPr>
+            <w:tcW w:type="dxa" w:w="4504"/>
+            <w:vAlign w:val="center"/>
+            <w:tcBorders>
+              <w:top w:val="single" w:sz="4" w:color="D9D9D9"/>
+              <w:left w:val="single" w:sz="4" w:color="D9D9D9"/>
+              <w:bottom w:val="single" w:sz="4" w:color="D9D9D9"/>
+              <w:right w:val="single" w:sz="4" w:color="D9D9D9"/>
+            </w:tcBorders>
+            <w:tcMar>
+              <w:top w:w="105" w:type="dxa"/>
+              <w:left w:w="105" w:type="dxa"/>
+              <w:bottom w:w="105" w:type="dxa"/>
+              <w:right w:w="105" w:type="dxa"/>
+            </w:tcMar>
+            <w:shd w:fill="233746"/>
+          </w:tcPr>
+          <w:p>
+            <w:pPr>
+              <w:spacing w:after="0" w:line="259" w:lineRule="auto"/>
+            </w:pPr>
+            <w:r>
+              <w:rPr>
+                <w:b/>
+                <w:color w:val="FFFFFF"/>
+                <w:sz w:val="18"/>
+              </w:rPr>
+              <w:t>Acceptance evidence</w:t>
+            </w:r>
+          </w:p>
+        </w:tc>
+      </w:tr>
+      <w:tr>
+        <w:trPr>
+          <w:cantSplit/>
+        </w:trPr>
+        <w:tc>
+          <w:tcPr>
+            <w:tcW w:type="dxa" w:w="1440"/>
+            <w:vAlign w:val="center"/>
+            <w:tcBorders>
+              <w:top w:val="single" w:sz="4" w:color="D9D9D9"/>
+              <w:left w:val="single" w:sz="4" w:color="D9D9D9"/>
+              <w:bottom w:val="single" w:sz="4" w:color="D9D9D9"/>
+              <w:right w:val="single" w:sz="4" w:color="D9D9D9"/>
+            </w:tcBorders>
+            <w:tcMar>
+              <w:top w:w="105" w:type="dxa"/>
+              <w:left w:w="105" w:type="dxa"/>
+              <w:bottom w:w="105" w:type="dxa"/>
+              <w:right w:w="105" w:type="dxa"/>
+            </w:tcMar>
+            <w:shd w:fill="FFFFFF"/>
+          </w:tcPr>
+          <w:p>
+            <w:pPr>
+              <w:spacing w:after="0" w:line="259" w:lineRule="auto"/>
+            </w:pPr>
+            <w:r>
+              <w:rPr>
+                <w:b w:val="0"/>
+                <w:color w:val="172D29"/>
+                <w:sz w:val="18"/>
+              </w:rPr>
+              <w:t>A1 owner</w:t>
+            </w:r>
+          </w:p>
+        </w:tc>
+        <w:tc>
+          <w:tcPr>
+            <w:tcW w:type="dxa" w:w="3888"/>
+            <w:vAlign w:val="center"/>
+            <w:tcBorders>
+              <w:top w:val="single" w:sz="4" w:color="D9D9D9"/>
+              <w:left w:val="single" w:sz="4" w:color="D9D9D9"/>
+              <w:bottom w:val="single" w:sz="4" w:color="D9D9D9"/>
+              <w:right w:val="single" w:sz="4" w:color="D9D9D9"/>
+            </w:tcBorders>
+            <w:tcMar>
+              <w:top w:w="105" w:type="dxa"/>
+              <w:left w:w="105" w:type="dxa"/>
+              <w:bottom w:w="105" w:type="dxa"/>
+              <w:right w:w="105" w:type="dxa"/>
+            </w:tcMar>
+            <w:shd w:fill="FFFFFF"/>
+          </w:tcPr>
+          <w:p>
+            <w:pPr>
+              <w:spacing w:after="0" w:line="259" w:lineRule="auto"/>
+            </w:pPr>
+            <w:r>
+              <w:rPr>
+                <w:b w:val="0"/>
+                <w:color w:val="172D29"/>
+                <w:sz w:val="18"/>
+              </w:rPr>
+              <w:t>Correction rights and export; separate trial from pilot duration</w:t>
+            </w:r>
+          </w:p>
+        </w:tc>
+        <w:tc>
+          <w:tcPr>
+            <w:tcW w:type="dxa" w:w="4504"/>
+            <w:vAlign w:val="center"/>
+            <w:tcBorders>
+              <w:top w:val="single" w:sz="4" w:color="D9D9D9"/>
+              <w:left w:val="single" w:sz="4" w:color="D9D9D9"/>
+              <w:bottom w:val="single" w:sz="4" w:color="D9D9D9"/>
+              <w:right w:val="single" w:sz="4" w:color="D9D9D9"/>
+            </w:tcBorders>
+            <w:tcMar>
+              <w:top w:w="105" w:type="dxa"/>
+              <w:left w:w="105" w:type="dxa"/>
+              <w:bottom w:w="105" w:type="dxa"/>
+              <w:right w:w="105" w:type="dxa"/>
+            </w:tcMar>
+            <w:shd w:fill="FFFFFF"/>
+          </w:tcPr>
+          <w:p>
+            <w:pPr>
+              <w:spacing w:after="0" w:line="259" w:lineRule="auto"/>
+            </w:pPr>
+            <w:r>
+              <w:rPr>
+                <w:b w:val="0"/>
+                <w:color w:val="172D29"/>
+                <w:sz w:val="18"/>
+              </w:rPr>
+              <w:t>Owner interprets a correction history and opens an export.</w:t>
+            </w:r>
+          </w:p>
+        </w:tc>
+      </w:tr>
+      <w:tr>
+        <w:trPr>
+          <w:cantSplit/>
+        </w:trPr>
+        <w:tc>
+          <w:tcPr>
+            <w:tcW w:type="dxa" w:w="1440"/>
+            <w:vAlign w:val="center"/>
+            <w:tcBorders>
+              <w:top w:val="single" w:sz="4" w:color="D9D9D9"/>
+              <w:left w:val="single" w:sz="4" w:color="D9D9D9"/>
+              <w:bottom w:val="single" w:sz="4" w:color="D9D9D9"/>
+              <w:right w:val="single" w:sz="4" w:color="D9D9D9"/>
+            </w:tcBorders>
+            <w:tcMar>
+              <w:top w:w="105" w:type="dxa"/>
+              <w:left w:w="105" w:type="dxa"/>
+              <w:bottom w:w="105" w:type="dxa"/>
+              <w:right w:w="105" w:type="dxa"/>
+            </w:tcMar>
+            <w:shd w:fill="F3F6F3"/>
+          </w:tcPr>
+          <w:p>
+            <w:pPr>
+              <w:spacing w:after="0" w:line="259" w:lineRule="auto"/>
+            </w:pPr>
+            <w:r>
+              <w:rPr>
+                <w:b w:val="0"/>
+                <w:color w:val="172D29"/>
+                <w:sz w:val="18"/>
+              </w:rPr>
+              <w:t>A2 staff</w:t>
+            </w:r>
+          </w:p>
+        </w:tc>
+        <w:tc>
+          <w:tcPr>
+            <w:tcW w:type="dxa" w:w="3888"/>
+            <w:vAlign w:val="center"/>
+            <w:tcBorders>
+              <w:top w:val="single" w:sz="4" w:color="D9D9D9"/>
+              <w:left w:val="single" w:sz="4" w:color="D9D9D9"/>
+              <w:bottom w:val="single" w:sz="4" w:color="D9D9D9"/>
+              <w:right w:val="single" w:sz="4" w:color="D9D9D9"/>
+            </w:tcBorders>
+            <w:tcMar>
+              <w:top w:w="105" w:type="dxa"/>
+              <w:left w:w="105" w:type="dxa"/>
+              <w:bottom w:w="105" w:type="dxa"/>
+              <w:right w:w="105" w:type="dxa"/>
+            </w:tcMar>
+            <w:shd w:fill="F3F6F3"/>
+          </w:tcPr>
+          <w:p>
+            <w:pPr>
+              <w:spacing w:after="0" w:line="259" w:lineRule="auto"/>
+            </w:pPr>
+            <w:r>
+              <w:rPr>
+                <w:b w:val="0"/>
+                <w:color w:val="172D29"/>
+                <w:sz w:val="18"/>
+              </w:rPr>
+              <w:t>Uncertain result, recent operation and single redemption</w:t>
+            </w:r>
+          </w:p>
+        </w:tc>
+        <w:tc>
+          <w:tcPr>
+            <w:tcW w:type="dxa" w:w="4504"/>
+            <w:vAlign w:val="center"/>
+            <w:tcBorders>
+              <w:top w:val="single" w:sz="4" w:color="D9D9D9"/>
+              <w:left w:val="single" w:sz="4" w:color="D9D9D9"/>
+              <w:bottom w:val="single" w:sz="4" w:color="D9D9D9"/>
+              <w:right w:val="single" w:sz="4" w:color="D9D9D9"/>
+            </w:tcBorders>
+            <w:tcMar>
+              <w:top w:w="105" w:type="dxa"/>
+              <w:left w:w="105" w:type="dxa"/>
+              <w:bottom w:w="105" w:type="dxa"/>
+              <w:right w:w="105" w:type="dxa"/>
+            </w:tcMar>
+            <w:shd w:fill="F3F6F3"/>
+          </w:tcPr>
+          <w:p>
+            <w:pPr>
+              <w:spacing w:after="0" w:line="259" w:lineRule="auto"/>
+            </w:pPr>
+            <w:r>
+              <w:rPr>
+                <w:b w:val="0"/>
+                <w:color w:val="172D29"/>
+                <w:sz w:val="18"/>
+              </w:rPr>
+              <w:t>Lost-response and concurrent-operation tests plus a staff task.</w:t>
+            </w:r>
+          </w:p>
+        </w:tc>
+      </w:tr>
+      <w:tr>
+        <w:trPr>
+          <w:cantSplit/>
+        </w:trPr>
+        <w:tc>
+          <w:tcPr>
+            <w:tcW w:type="dxa" w:w="1440"/>
+            <w:vAlign w:val="center"/>
+            <w:tcBorders>
+              <w:top w:val="single" w:sz="4" w:color="D9D9D9"/>
+              <w:left w:val="single" w:sz="4" w:color="D9D9D9"/>
+              <w:bottom w:val="single" w:sz="4" w:color="D9D9D9"/>
+              <w:right w:val="single" w:sz="4" w:color="D9D9D9"/>
+            </w:tcBorders>
+            <w:tcMar>
+              <w:top w:w="105" w:type="dxa"/>
+              <w:left w:w="105" w:type="dxa"/>
+              <w:bottom w:w="105" w:type="dxa"/>
+              <w:right w:w="105" w:type="dxa"/>
+            </w:tcMar>
+            <w:shd w:fill="FFFFFF"/>
+          </w:tcPr>
+          <w:p>
+            <w:pPr>
+              <w:spacing w:after="0" w:line="259" w:lineRule="auto"/>
+            </w:pPr>
+            <w:r>
+              <w:rPr>
+                <w:b w:val="0"/>
+                <w:color w:val="172D29"/>
+                <w:sz w:val="18"/>
+              </w:rPr>
+              <w:t>A3 guest</w:t>
+            </w:r>
+          </w:p>
+        </w:tc>
+        <w:tc>
+          <w:tcPr>
+            <w:tcW w:type="dxa" w:w="3888"/>
+            <w:vAlign w:val="center"/>
+            <w:tcBorders>
+              <w:top w:val="single" w:sz="4" w:color="D9D9D9"/>
+              <w:left w:val="single" w:sz="4" w:color="D9D9D9"/>
+              <w:bottom w:val="single" w:sz="4" w:color="D9D9D9"/>
+              <w:right w:val="single" w:sz="4" w:color="D9D9D9"/>
+            </w:tcBorders>
+            <w:tcMar>
+              <w:top w:w="105" w:type="dxa"/>
+              <w:left w:w="105" w:type="dxa"/>
+              <w:bottom w:w="105" w:type="dxa"/>
+              <w:right w:w="105" w:type="dxa"/>
+            </w:tcMar>
+            <w:shd w:fill="FFFFFF"/>
+          </w:tcPr>
+          <w:p>
+            <w:pPr>
+              <w:spacing w:after="0" w:line="259" w:lineRule="auto"/>
+            </w:pPr>
+            <w:r>
+              <w:rPr>
+                <w:b w:val="0"/>
+                <w:color w:val="172D29"/>
+                <w:sz w:val="18"/>
+              </w:rPr>
+              <w:t>Reward wording, private wallet and verified recovery</w:t>
+            </w:r>
+          </w:p>
+        </w:tc>
+        <w:tc>
+          <w:tcPr>
+            <w:tcW w:type="dxa" w:w="4504"/>
+            <w:vAlign w:val="center"/>
+            <w:tcBorders>
+              <w:top w:val="single" w:sz="4" w:color="D9D9D9"/>
+              <w:left w:val="single" w:sz="4" w:color="D9D9D9"/>
+              <w:bottom w:val="single" w:sz="4" w:color="D9D9D9"/>
+              <w:right w:val="single" w:sz="4" w:color="D9D9D9"/>
+            </w:tcBorders>
+            <w:tcMar>
+              <w:top w:w="105" w:type="dxa"/>
+              <w:left w:w="105" w:type="dxa"/>
+              <w:bottom w:w="105" w:type="dxa"/>
+              <w:right w:w="105" w:type="dxa"/>
+            </w:tcMar>
+            <w:shd w:fill="FFFFFF"/>
+          </w:tcPr>
+          <w:p>
+            <w:pPr>
+              <w:spacing w:after="0" w:line="259" w:lineRule="auto"/>
+            </w:pPr>
+            <w:r>
+              <w:rPr>
+                <w:b w:val="0"/>
+                <w:color w:val="172D29"/>
+                <w:sz w:val="18"/>
+              </w:rPr>
+              <w:t>Guest explains reward timing; cross-company and recovery tests.</w:t>
+            </w:r>
+          </w:p>
+        </w:tc>
+      </w:tr>
+    </w:tbl>
+    <w:p>
+      <w:pPr>
+        <w:spacing w:after="0"/>
+      </w:pPr>
     </w:p>
     <w:p>
       <w:pPr>
         <w:pStyle w:val="Caption"/>
       </w:pPr>
       <w:r>
-        <w:t>Permission to use AI assistance does not itself constitute approval of the report. Record the actual response, retain unresolved points and revise the submission-status matrix when evidence becomes available.</w:t>
+        <w:t>The scenarios produce candidate requirements, not a vote for the idea. No participant counts, satisfaction percentages or purchase commitments are reported. Real discussions should use past-behaviour questions before presenting the prototype and retain anonymised notes, including contradictory observations.</w:t>
+      </w:r>
+    </w:p>
+    <w:p>
+      <w:r>
+        <w:br w:type="page"/>
+      </w:r>
+    </w:p>
+    <w:p>
+      <w:pPr>
+        <w:pStyle w:val="Heading1"/>
+      </w:pPr>
+      <w:r>
+        <w:t>Appendix B  Review and team response</w:t>
+      </w:r>
+    </w:p>
+    <w:p>
+      <w:r>
+        <w:t>Actual teacher feedback reported by Armat is separated from an AI-simulated adviser conversation.</w:t>
+      </w:r>
+    </w:p>
+    <w:p>
+      <w:pPr>
+        <w:pStyle w:val="Heading2"/>
+      </w:pPr>
+      <w:r>
+        <w:t>Received feedback</w:t>
+      </w:r>
+    </w:p>
+    <w:p>
+      <w:r>
+        <w:t>Armat relayed two comments from the teacher on 24 October 2026: the report looked generated, and it needed at least twelve sources. This is a student-reported summary; no signed review, original review file or acceptance of this revision was supplied.</w:t>
+      </w:r>
+    </w:p>
+    <w:p>
+      <w:r>
+        <w:t>Response: this edition contains twelve scientific publications and fourteen official product or technical sources. The literature section now compares findings, explains limits and connects them to requirements and evaluation choices. Generic summaries have been replaced with specific examples such as the difference between repeat share and retention, and a retry after a lost server response.</w:t>
+      </w:r>
+    </w:p>
+    <w:p>
+      <w:pPr>
+        <w:pStyle w:val="Heading2"/>
+      </w:pPr>
+      <w:r>
+        <w:t>Simulated adviser dialogue</w:t>
+      </w:r>
+    </w:p>
+    <w:p>
+      <w:r>
+        <w:t>The following exchange was generated with AI for preparation. The adviser is a fictional role and does not represent Elvira Aitmukhanbetova’s words or approval.</w:t>
+      </w:r>
+    </w:p>
+    <w:p>
+      <w:r>
+        <w:t>Student: We expanded the references. What would still make the report weak?</w:t>
+      </w:r>
+    </w:p>
+    <w:p>
+      <w:r>
+        <w:t>Adviser role: A longer list is not enough. Explain which decision each source changes. For example, why do you measure repeat visits rather than simply count accounts?</w:t>
+      </w:r>
+    </w:p>
+    <w:p>
+      <w:r>
+        <w:t>Student: Registration can select people who were already regulars. We therefore separate the event metrics from claims about an increase in loyalty, and state the comparison period.</w:t>
+      </w:r>
+    </w:p>
+    <w:p>
+      <w:r>
+        <w:t>Adviser role: Then show that distinction in the dashboard and the evaluation plan. What can the committee actually verify at this milestone?</w:t>
+      </w:r>
+    </w:p>
+    <w:p>
+      <w:r>
+        <w:t>Student: The requirements, diagrams, static concepts and repository checks. The new diploma repository does not yet demonstrate the complete application.</w:t>
+      </w:r>
+    </w:p>
+    <w:p>
+      <w:r>
+        <w:t>Adviser role: Keep that boundary explicit. Also, these AI dialogues can help you identify missed cases, but they do not tell you how a real owner behaves. Do not report them as interviews.</w:t>
+      </w:r>
+    </w:p>
+    <w:p>
+      <w:r>
+        <w:t>Student: We label them as simulations and retain field validation as a later task. The next review should confirm the scope and whether this exercise satisfies the milestone’s discussion requirement.</w:t>
+      </w:r>
+    </w:p>
+    <w:p>
+      <w:pPr>
+        <w:pStyle w:val="Heading2"/>
+      </w:pPr>
+      <w:r>
+        <w:t>Outstanding acceptance</w:t>
+      </w:r>
+    </w:p>
+    <w:p>
+      <w:r>
+        <w:t>The revision addresses the reported source-count and specificity comments. Supervisor acceptance, the adequacy of AI scenarios for the university criterion, and the dates of later milestones still require confirmation. No approval, signature or participant response is generated on behalf of another person.</w:t>
       </w:r>
     </w:p>
     <w:sectPr>
@@ -11687,7 +12760,7 @@
       <w:color w:val="000000"/>
       <w:spacing w:val="5"/>
       <w:kern w:val="28"/>
-      <w:sz w:val="68"/>
+      <w:sz w:val="60"/>
       <w:szCs w:val="52"/>
     </w:rPr>
   </w:style>

</xml_diff>

<commit_message>
DIP-14: Rewrite report around concrete design decisions
</commit_message>
<xml_diff>
--- a/docs/report/en/Tappix-Pre-Defense-Report-EN.docx
+++ b/docs/report/en/Tappix-Pre-Defense-Report-EN.docx
@@ -50,17 +50,17 @@
     </w:p>
     <w:p>
       <w:r>
-        <w:t>We propose a multi-tenant web platform for independent coffee shops, bakeries and salons in Kazakhstan. Guests keep digital loyalty cards, staff record qualifying visits and redeem rewards, and owners review activity within their own company. The platform administrator provisions businesses and assigns plans and a seven-day trial.</w:t>
+        <w:t>At a café counter, a guest may have a card but neither the guest nor the cashier can easily tell which visit was last recorded. Tappix is our proposal for that small moment: a digital card, a staff confirmation step and a record the owner can inspect. The same design must work across cafés, bakeries and salons while keeping each business's data separate. An administrator would assign access and a seven-day trial.</w:t>
       </w:r>
     </w:p>
     <w:p>
       <w:r>
-        <w:t>This submission defines the problem, evidence, requirements, architecture and evaluation method. Six newly designed static interface concepts illustrate the intended workflow. They are not screenshots of the existing application and do not demonstrate implemented functionality.</w:t>
+        <w:t>For this milestone we prepared requirements, a literature review, product and technology comparisons, architecture diagrams and a plan for testing. The six screens later in this report are new static concepts. They explain the intended flow; they are not evidence that the diploma implementation already runs.</w:t>
       </w:r>
     </w:p>
     <w:p>
       <w:r>
-        <w:t>The principal engineering question is whether the system can combine company isolation, consistent reward accounting and a usable service-counter workflow. Demand, willingness to pay and sales impact remain hypotheses for real-world evaluation.</w:t>
+        <w:t>The difficult part is not drawing a card with six circles. We need to ensure that a visit is credited once, that a reward cannot be redeemed twice and that a cashier in one business never sees another business's guests. We have not yet measured whether owners want this service or will pay for it.</w:t>
       </w:r>
     </w:p>
     <w:p>
@@ -725,7 +725,7 @@
     </w:p>
     <w:p>
       <w:r>
-        <w:t>A limited product scope makes the system testable and keeps the two-student implementation feasible.</w:t>
+        <w:t>We chose one end-to-end path to design first: a guest opens a card, staff confirm a visit, a reward becomes available, and the owner can account for the event.</w:t>
       </w:r>
     </w:p>
     <w:p>
@@ -738,12 +738,12 @@
     </w:p>
     <w:p>
       <w:r>
-        <w:t>Paper cards and manually maintained records may leave owners without a consistent history of visits and rewards. Staff may need to resolve lost cards or disputed redemptions, while guests may struggle to understand their progress. These are proposed problems, not findings from interviews with Kazakhstani businesses.</w:t>
+        <w:t>Consider a guest who loses a paper card after several visits. The cashier may trust the guest but cannot check a shared history; the owner may later find it hard to reconcile a redeemed reward. A digital record could help, but it also creates new work if scanning fails or the customer cannot recover an account. These are scenarios we need to check with real businesses in Kazakhstan, not findings from interviews.</w:t>
       </w:r>
     </w:p>
     <w:p>
       <w:r>
-        <w:t>Research question: can a web-based loyalty system provide correct, company-isolated accounting and a clear customer-service workflow that compares favourably with a familiar manual process? The expected contribution is an implemented and reproducibly evaluated information system, not a novel loyalty algorithm.</w:t>
+        <w:t>Our research question is practical: can a small business replace a paper or manual loyalty process with a web system whose records are correct, whose company boundaries hold, and whose counter workflow staff can actually use? The diploma contribution will be the implemented system and a reproducible evaluation of those properties, rather than a new loyalty algorithm.</w:t>
       </w:r>
     </w:p>
     <w:tbl>
@@ -1374,12 +1374,12 @@
     </w:p>
     <w:p>
       <w:r>
-        <w:t>Belli et al. [S1] synthesise 429 effect sizes and distinguish behavioural loyalty from attitudes toward a business. Chen et al. [S2] organise 131 publications by theory, context, programme characteristics and method. Together, they suggest that a programme should be described through its rules and setting before its effectiveness is assessed. A count of registered cards alone does not answer whether guests return more often.</w:t>
+        <w:t>Belli et al. [S1] combine 429 effect sizes but separate repeated behaviour from favourable attitudes. Chen et al. [S2] review 131 publications and show how programme design and setting affect interpretation. That matters for our dashboard: issuing 90 cards does not show that 90 people returned. We therefore need event dates and a stated observation period before we call any guest a repeat visitor.</w:t>
       </w:r>
     </w:p>
     <w:p>
       <w:r>
-        <w:t>Dorotic et al. [S9] explain why apparently conflicting results can coexist: programme effects vary across customer segments and markets. For Tappix, the initial unit of analysis should therefore be one business and its eligible guests. Aggregating unrelated salons and coffee shops into a single return rate would obscure different visit cycles.</w:t>
+        <w:t>Dorotic et al. [S9] describe why programme findings differ between segments and markets. A salon visit may be months apart while a café visit may happen several times a week. We would mislead an owner if we mixed both businesses into one return-rate figure, so Tappix will calculate company-level measures using an explicit time window.</w:t>
       </w:r>
     </w:p>
     <w:p>
@@ -1397,7 +1397,7 @@
     </w:p>
     <w:p>
       <w:r>
-        <w:t>We consequently define the engineering contribution as reliable event recording, access boundaries and a usable counter workflow. Business benefit is a separate evaluation question. The owner dashboard will report visits and redemptions with named definitions, rather than displaying an unsupported sales-growth estimate.</w:t>
+        <w:t>We will judge the software first by whether it records and retrieves the right events. A dashboard that says '204 visits' must point back to the same 204 eligible visit records. Whether those records help an owner make a better decision is a separate question for a pilot. The interface will not invent an uplift in sales.</w:t>
       </w:r>
     </w:p>
     <w:p>
@@ -1441,7 +1441,7 @@
     </w:p>
     <w:p>
       <w:r>
-        <w:t>The concept therefore shows four confirmed visits out of six, a named reward and two remaining visits. If a business later offers a welcome credit, the interface and ledger must distinguish that promotion from a visit. We defer such promotions in the first implementation so the basic history stays easy to explain.</w:t>
+        <w:t>We chose a specific example for the card: four confirmed visits towards a reward after the sixth, leaving two visits. It lets a guest understand the rule without interpreting a row of blank circles. A promotional welcome credit would need its own event type; calling it a visit would make the history false. We leave that promotion out of the first build.</w:t>
       </w:r>
     </w:p>
     <w:p>
@@ -1459,7 +1459,7 @@
     </w:p>
     <w:p>
       <w:r>
-        <w:t>The staff design includes confirmation before a visit and a separate redemption action. These choices are operational hypotheses: a fast scanner is of little use if a cashier cannot tell whether a timed-out request succeeded. The evaluation must include camera refusal and a response lost after the database commit.</w:t>
+        <w:t>At the counter, the awkward case is a lost response after the server has saved a visit. A cashier who sees only an error may press Confirm again. Our design therefore needs a visible 'checking result' state and a safe retry that returns the first result. We will also test what happens when the camera is unavailable. These choices still need usability checks with real staff.</w:t>
       </w:r>
     </w:p>
     <w:p>
@@ -1516,7 +1516,7 @@
     </w:p>
     <w:p>
       <w:r>
-        <w:t>Leenheer et al. [S10] use household panel data and model the decision to join a programme. The estimated programme effect is smaller when self-selection is considered. This matters because guests who already visit often may be the first to register. Comparing registered and unregistered guests once would confound the programme with their earlier behaviour.</w:t>
+        <w:t>Leenheer et al. [S10] account for the fact that people choose whether to join a programme. When that choice is modelled, the estimated effect is smaller. In our setting, regular café guests might be the first to sign up. A simple comparison of registered and unregistered guests would confuse that pre-existing habit with a Tappix effect.</w:t>
       </w:r>
     </w:p>
     <w:p>
@@ -1534,7 +1534,7 @@
     </w:p>
     <w:p>
       <w:r>
-        <w:t>A short pilot can establish whether a staff member records a valid visit without help, whether the reward is issued once, and whether the owner understands a metric. It cannot establish a stable retention effect for businesses with infrequent visits. A salon may require a longer observation window than a coffee shop; the period must be chosen before interpreting results.</w:t>
+        <w:t>A first pilot can tell us whether a cashier can complete a visit without help, whether the same visit is recorded once and whether an owner understands the weekly figures. It cannot tell us that customer loyalty improved. A week may include several café visits but no second salon appointment. We need to choose the observation period for each business before drawing conclusions.</w:t>
       </w:r>
     </w:p>
     <w:p>
@@ -3163,7 +3163,7 @@
     </w:p>
     <w:p>
       <w:r>
-        <w:t>A paper card is simple to introduce but may not provide a shared owner history. A spreadsheet can record events without another subscription, at the cost of manual entry and access management. These are analytical assumptions to verify through observation. Keeping the current process is reasonable when switching costs exceed the expected benefit.</w:t>
+        <w:t>The obvious alternative is to keep using paper. It costs little to start and staff already know it. A spreadsheet is another realistic choice if an owner is willing to enter each visit and manage access manually. We have not timed those workflows in a real venue yet. Tappix has to earn a switch by reducing a specific problem without slowing the queue.</w:t>
       </w:r>
     </w:p>
     <w:p>
@@ -3176,7 +3176,7 @@
     </w:p>
     <w:p>
       <w:r>
-        <w:t>Tappix explores a standalone web card and staff workflow without requiring a cash-register replacement. The intended distinction is a small, understandable feature set with company-scoped access and explicit metric definitions. Existing products already cover much of the use case; this comparison does not establish that Tappix is better.</w:t>
+        <w:t>Our proposed difference is a card that opens by link, a short staff flow and reports that explain exactly what they count. The system should fit beside an existing register rather than require a replacement. That is a design intention, not a verified advantage: the product comparison shows that existing services already cover many of the same tasks.</w:t>
       </w:r>
     </w:p>
     <w:p>
@@ -5429,7 +5429,7 @@
     </w:p>
     <w:p>
       <w:r>
-        <w:t>A scanned QR or NFC link identifies a card; it does not authorise a visit. The trusted company context comes from the validated session and membership. An assigned plan is not proof of payment. Points are not transferable money, and a multi-card wallet does not merge businesses’ customer databases.</w:t>
+        <w:t>Scanning a QR code tells the server which card to look up. It does not give the cashier permission to change that card. The server must take the company and staff rights from the authenticated session, then reject a card issued by another company. A guest may see several cards in one wallet, but the businesses must never share a customer database.</w:t>
       </w:r>
     </w:p>
     <w:p>
@@ -6419,7 +6419,7 @@
     </w:p>
     <w:p>
       <w:r>
-        <w:t>Scope each idempotency key by company, actor and operation, and bind it to a request-body hash. Store the operation result in the same transaction as the visit or ledger change. Use database constraints and appropriate locking to enforce invariants. A retry after a lost response must recover the committed result rather than repeat the effect.</w:t>
+        <w:t>Suppose the first visit request commits but the connection breaks before the cashier sees the reply. The cashier retries. We will give the operation a key tied to its company, actor, action and request body, save the result with the visit in one transaction, and return that same result on retry. Locking and database constraints must also prevent two different requests from redeeming one reward.</w:t>
       </w:r>
     </w:p>
     <w:p>
@@ -6437,7 +6437,7 @@
     </w:p>
     <w:p>
       <w:r>
-        <w:t>Keep PostgreSQL and Redis off public interfaces, protect private files through authorised access, and separate recovery credentials from the server. External encrypted backup storage has not been connected in the diploma repository. Before a pilot, validate actual restoration, alert delivery and expiry reminders independent of the application server.</w:t>
+        <w:t>A local backup is useful after an accidental change, but it will not help if the server and its disks disappear together. Before a pilot we need encrypted copies of both the database and uploaded files outside that server, a separately stored recovery key, and a restore on a clean machine. We also need to see a real alert when a copy fails. Those checks have not been completed for this diploma implementation.</w:t>
       </w:r>
     </w:p>
     <w:p>
@@ -6600,7 +6600,7 @@
     </w:p>
     <w:p>
       <w:r>
-        <w:t>Identifying a guest must not automatically credit a visit. Staff first see the matched company and current progress, then confirm one qualifying action. When a reward becomes available, redemption is a separate action recorded against the staff identity.</w:t>
+        <w:t>The scanner should first show the card it found, its business and its current progress. Only after the cashier confirms a qualifying visit should the server write an event. Reaching six visits makes a reward available; using the reward later is another action and another record. This distinction lets a guest save the reward for the next visit.</w:t>
       </w:r>
     </w:p>
     <w:p>
@@ -6613,7 +6613,7 @@
     </w:p>
     <w:p>
       <w:r>
-        <w:t>A foreign-company card produces a clear denial without guest details. A network timeout produces an uncertain state until the same operation can be checked or retried safely. Corrections must create auditable records rather than silently remove history. Exact correction and rollover rules require team review.</w:t>
+        <w:t>If the scanned card belongs to another company, staff should see a short refusal without that guest's history. If the network times out, the screen cannot assume either success or failure; it must check the operation and allow a safe retry. A correction should create a traceable reversal instead of erasing the original visit. Who can authorise one is still undecided.</w:t>
       </w:r>
     </w:p>
     <w:p>
@@ -6763,7 +6763,7 @@
     </w:p>
     <w:p>
       <w:r>
-        <w:t>The wallet brings verified cards together without combining programmes. The card view gives one primary action, a concrete reward and a count of remaining visits. Colour is supported by text and numbers. A visit history helps the guest understand changes.</w:t>
+        <w:t>A guest could have a café card and a salon card under one login, much like choosing among cards in a wallet. The cards remain separate programmes. On each card we show the reward, confirmed progress and remaining visits in words as well as colour. The history should explain why the count changed, especially after a correction.</w:t>
       </w:r>
     </w:p>
     <w:p>
@@ -6847,7 +6847,7 @@
     </w:p>
     <w:p>
       <w:r>
-        <w:t>The confirmation screen shows the matched company and intended effect before the write. After redemption succeeds, the interface must show the recorded result and remove the available redemption action. Disabling a button improves clarity but is not the protection against duplicate requests.</w:t>
+        <w:t>Before submitting, the cashier sees the matched business and the action about to happen. After redemption, the screen should show when it was recorded and remove the available-reward action. A disabled button alone cannot stop a second request from another device; the server must enforce the single redemption.</w:t>
       </w:r>
     </w:p>
     <w:p>
@@ -7286,7 +7286,7 @@
     </w:p>
     <w:p>
       <w:r>
-        <w:t>The bars use 18, 24, 21, 30, 36, 42 and 33 visits, which sum to 204. This checks internal arithmetic only. In the implemented system, selected company, branch, timezone and date interval must be explicit, and all totals must be reproducible from events.</w:t>
+        <w:t>We deliberately made the sample chart add up: 18 + 24 + 21 + 30 + 36 + 42 + 33 = 204 visits. These are invented figures for checking the screen, not pilot data. In the working system the owner must see the selected company, branch, timezone and dates, and the total must be reproducible from recorded events.</w:t>
       </w:r>
     </w:p>
     <w:p>
@@ -7370,7 +7370,7 @@
     </w:p>
     <w:p>
       <w:r>
-        <w:t>The design separates the assigned plan from payment status. An administrator may provide trial access without recording a payment. Individual overrides must be visible alongside usage, and the server must enforce the effective values rather than trusting hidden interface controls.</w:t>
+        <w:t>The administrator can grant a trial or assign a plan, but neither action means a payment was received. The interface should show an agreed limit, any business-specific override, current usage and what remains. The Go API must calculate and enforce the effective limit; hiding a button in the browser would not be sufficient.</w:t>
       </w:r>
     </w:p>
     <w:p>
@@ -8153,7 +8153,7 @@
     </w:p>
     <w:p>
       <w:r>
-        <w:t>Proposed pilot targets are an RPO of up to 24 hours and an RTO of up to 4 hours. These are not achieved service guarantees. A daily backup can lose events since the last successful copy; a smaller RPO needs more frequent protection or WAL archiving. Retain the recovery key separately and alert on missing or failed backups.</w:t>
+        <w:t>For a pilot we propose, rather than promise, a maximum data loss of 24 hours and a restoration time of four hours. Daily copies can still lose a day's visits. If that is unacceptable, we must increase backup frequency or archive database logs. We will measure both targets by restoring an encrypted database and file set away from the original server.</w:t>
       </w:r>
     </w:p>
     <w:p>
@@ -8166,7 +8166,7 @@
     </w:p>
     <w:p>
       <w:r>
-        <w:t>After technical checks, a 2–3 business pilot can test operational fit. Record service changes, promotions, staffing and seasonality. A small uncontrolled pilot cannot establish general market demand or causal sales growth. Do not convert five usability participants into a market-success percentage.</w:t>
+        <w:t>After technical tests, a small pilot with two or three businesses could reveal whether the workflow survives a real shift. We would record promotions, opening hours and staffing alongside visit data, because they affect the numbers. Even a successful pilot of that size would not prove demand across Kazakhstan or a causal rise in sales.</w:t>
       </w:r>
     </w:p>
     <w:p>
@@ -9125,12 +9125,12 @@
     </w:p>
     <w:p>
       <w:r>
-        <w:t>Armat owns frontend, UX and visualisation. Yersultan owns Go, PostgreSQL, Redis and infrastructure. Each student uses their own account and records their own work. AI-prepared material committed by Armat is not represented as Yersultan’s personal contribution. The existing implementation and its Git history remain separate.</w:t>
+        <w:t>We divided the implementation responsibilities by area: Armat will handle the interface, UX and charts; Yersultan will handle the Go service, data stores and deployment configuration. Work is attributed to the account that actually commits or reviews it. Materials prepared with AI under Armat's account do not become Yersultan's personal contribution merely because they fall in his assigned area.</w:t>
       </w:r>
     </w:p>
     <w:p>
       <w:r>
-        <w:t>GitHub: islqdev/tappix-diploma. Yersultan’s Ersultan7 account has accepted collaborator access. PRs #1–6 form a dependent sequence and await his review. Merge in order after approval; create pre-defense-1 on the accepted revision and never move the tag. Automatic branch protection was not confirmed for the private repository; the agreed review procedure remains a team rule.</w:t>
+        <w:t>The development repository is github.com/islqdev/tappix-diploma. PRs #1–6 contain the design-stage work and still await a personal review by Yersultan; he has collaborator access through Ersultan7. A separate public repository, github.com/islqdev/tappix-diploma-materials, lets the committee read the report and designs. It does not expose the private development history. The reviewed baseline and submission tag must still be created after the team checks the changes.</w:t>
       </w:r>
     </w:p>
     <w:p>
@@ -10437,12 +10437,12 @@
     </w:p>
     <w:p>
       <w:r>
-        <w:t>The teacher requested at least 12 sources and more substantive presentation. This revision adds four scientific studies, thematic synthesis and traceable design decisions. Appendix A contains permitted AI role-play for requirements exploration; it supplies no real participant evidence. Ask the supervisor to confirm whether that exercise is acceptable for this milestone before treating the user-discussion criterion as satisfied.</w:t>
+        <w:t>The teacher's two comments were direct: the report looked generated and it needed at least twelve sources. We kept twelve scientific publications and added concrete consequences for the system: what a 'repeat guest' means, why a registered card is not a loyalty result, and why a retry must not award a second visit. Appendix A is an AI exercise to expose possible objections. It does not count as conversations with actual owners, staff or guests.</w:t>
       </w:r>
     </w:p>
     <w:p>
       <w:r>
-        <w:t>Yersultan should personally review the repository changes from his account. Address findings before merging and tagging the accepted baseline. Then implement the smallest working API/UI slice and extend it through testable, task-linked pull requests.</w:t>
+        <w:t>Yersultan can review the diagrams and requirements with Armat on the same laptop while his laptop is unavailable. Armat may record that discussion under his own account with the exact points checked and who said what. It will not appear as a GitHub review from Ersultan7. The team should resolve any findings before merging; the next development step is one small API and UI path with tests.</w:t>
       </w:r>
     </w:p>
     <w:p>
@@ -11921,12 +11921,12 @@
     </w:p>
     <w:p>
       <w:r>
-        <w:t>Armat relayed two comments from the teacher on 24 October 2026: the report looked generated, and it needed at least twelve sources. This is a student-reported summary; no signed review, original review file or acceptance of this revision was supplied.</w:t>
+        <w:t>On 24 October 2026 Armat passed on two comments from the teacher: the writing sounded generated and the reference list needed at least twelve sources. We have the comments as reported by Armat; we do not have a signed review or acceptance of this revision.</w:t>
       </w:r>
     </w:p>
     <w:p>
       <w:r>
-        <w:t>Response: this edition contains twelve scientific publications and fourteen official product or technical sources. The literature section now compares findings, explains limits and connects them to requirements and evaluation choices. Generic summaries have been replaced with specific examples such as the difference between repeat share and retention, and a retry after a lost server response.</w:t>
+        <w:t>We revised the report around decisions a reader can inspect. The literature section now explains why enrolment is a weak outcome measure. The prototype distinguishes a visit from redemption. The evaluation plan includes a lost-response retry and a check that chart totals agree with events. The bibliography contains twelve scientific articles and fourteen official product or technical sources. Whether the new prose and evidence satisfy the teacher remains for the teacher to judge.</w:t>
       </w:r>
     </w:p>
     <w:p>

</xml_diff>